<commit_message>
Simplify phase-noise pipelines and refresh report
</commit_message>
<xml_diff>
--- a/İki Kanallı Cross.docx
+++ b/İki Kanallı Cross.docx
@@ -20,10 +20,17 @@
     </w:p>
     <w:p>
       <w:pPr>
-        <w:rPr>
-          <w:rFonts w:cs="Arial"/>
-        </w:rPr>
-      </w:pPr>
+        <w:pStyle w:val="Subtitle"/>
+        <w:rPr>
+          <w:rFonts w:ascii="Arial" w:hAnsi="Arial" w:cs="Arial"/>
+        </w:rPr>
+      </w:pPr>
+      <w:r>
+        <w:rPr>
+          <w:rFonts w:ascii="Arial" w:hAnsi="Arial" w:cs="Arial"/>
+        </w:rPr>
+        <w:t>Ömer Faruk Yazıcı</w:t>
+      </w:r>
     </w:p>
     <w:p>
       <w:pPr>
@@ -737,7 +744,7 @@
                     <pic:cNvPicPr/>
                   </pic:nvPicPr>
                   <pic:blipFill>
-                    <a:blip r:embed="rId7"/>
+                    <a:blip r:embed="rId8"/>
                     <a:stretch>
                       <a:fillRect/>
                     </a:stretch>
@@ -805,15 +812,7 @@
     </w:p>
     <w:p>
       <w:r>
-        <w:t xml:space="preserve">Faz gürültüsü çoğunlukla taşıyıcıdan belirli bir </w:t>
-      </w:r>
-      <w:proofErr w:type="spellStart"/>
-      <w:r>
-        <w:t>offset</w:t>
-      </w:r>
-      <w:proofErr w:type="spellEnd"/>
-      <w:r>
-        <w:t xml:space="preserve"> frekansındaki 1 Hz bant genişliğine </w:t>
+        <w:t xml:space="preserve">Faz gürültüsü çoğunlukla taşıyıcıdan belirli bir offset frekansındaki 1 Hz bant genişliğine </w:t>
       </w:r>
       <w:proofErr w:type="spellStart"/>
       <w:r>
@@ -1225,7 +1224,7 @@
                     <pic:cNvPicPr/>
                   </pic:nvPicPr>
                   <pic:blipFill>
-                    <a:blip r:embed="rId8"/>
+                    <a:blip r:embed="rId9"/>
                     <a:stretch>
                       <a:fillRect/>
                     </a:stretch>
@@ -1315,6 +1314,803 @@
           <w:b/>
         </w:rPr>
         <w:lastRenderedPageBreak/>
+        <w:t>Faz Gürültüsünün Etkileri</w:t>
+      </w:r>
+    </w:p>
+    <w:p>
+      <w:r>
+        <w:t xml:space="preserve">Faz gürültüsünü minimize etmenin önemini en iyi şekilde etkilerine bakarak anlayabiliriz. En yaygın üç etkisi </w:t>
+      </w:r>
+      <w:proofErr w:type="spellStart"/>
+      <w:r>
+        <w:t>spectral</w:t>
+      </w:r>
+      <w:proofErr w:type="spellEnd"/>
+      <w:r>
+        <w:t xml:space="preserve"> </w:t>
+      </w:r>
+      <w:proofErr w:type="spellStart"/>
+      <w:r>
+        <w:t>regrowth</w:t>
+      </w:r>
+      <w:proofErr w:type="spellEnd"/>
+      <w:r>
+        <w:t xml:space="preserve">, hassasiyet ve seçicilikte düşüş ve artan bit </w:t>
+      </w:r>
+      <w:proofErr w:type="spellStart"/>
+      <w:r>
+        <w:t>error’ları</w:t>
+      </w:r>
+      <w:r>
+        <w:t>dır</w:t>
+      </w:r>
+      <w:proofErr w:type="spellEnd"/>
+      <w:r>
+        <w:t>.</w:t>
+      </w:r>
+    </w:p>
+    <w:p>
+      <w:pPr>
+        <w:pStyle w:val="Heading2"/>
+      </w:pPr>
+      <w:r>
+        <w:t xml:space="preserve">3.1. Faz gürültüsü ve </w:t>
+      </w:r>
+      <w:proofErr w:type="spellStart"/>
+      <w:r>
+        <w:t>spectral</w:t>
+      </w:r>
+      <w:proofErr w:type="spellEnd"/>
+      <w:r>
+        <w:t xml:space="preserve"> </w:t>
+      </w:r>
+      <w:proofErr w:type="spellStart"/>
+      <w:r>
+        <w:t>regrowth</w:t>
+      </w:r>
+      <w:proofErr w:type="spellEnd"/>
+    </w:p>
+    <w:p>
+      <w:r>
+        <w:t xml:space="preserve">Yerel osilatör sinyalindeki herhangi bir faz gürültüsü giriş sinyali ile karışır. Bu da </w:t>
+      </w:r>
+      <w:proofErr w:type="spellStart"/>
+      <w:r>
+        <w:t>mixer</w:t>
+      </w:r>
+      <w:proofErr w:type="spellEnd"/>
+      <w:r>
+        <w:t xml:space="preserve"> çıkışının da gürültülü çıkmasına sebebiyet verir.</w:t>
+      </w:r>
+    </w:p>
+    <w:p>
+      <w:pPr>
+        <w:jc w:val="center"/>
+      </w:pPr>
+      <w:r>
+        <w:drawing>
+          <wp:inline distT="0" distB="0" distL="0" distR="0" wp14:anchorId="056AB8E4" wp14:editId="0FFFF389">
+            <wp:extent cx="4214192" cy="1396369"/>
+            <wp:effectExtent l="0" t="0" r="0" b="0"/>
+            <wp:docPr id="16" name="Picture 16"/>
+            <wp:cNvGraphicFramePr>
+              <a:graphicFrameLocks xmlns:a="http://schemas.openxmlformats.org/drawingml/2006/main" noChangeAspect="1"/>
+            </wp:cNvGraphicFramePr>
+            <a:graphic xmlns:a="http://schemas.openxmlformats.org/drawingml/2006/main">
+              <a:graphicData uri="http://schemas.openxmlformats.org/drawingml/2006/picture">
+                <pic:pic xmlns:pic="http://schemas.openxmlformats.org/drawingml/2006/picture">
+                  <pic:nvPicPr>
+                    <pic:cNvPr id="1" name=""/>
+                    <pic:cNvPicPr/>
+                  </pic:nvPicPr>
+                  <pic:blipFill>
+                    <a:blip r:embed="rId10"/>
+                    <a:stretch>
+                      <a:fillRect/>
+                    </a:stretch>
+                  </pic:blipFill>
+                  <pic:spPr>
+                    <a:xfrm>
+                      <a:off x="0" y="0"/>
+                      <a:ext cx="4231455" cy="1402089"/>
+                    </a:xfrm>
+                    <a:prstGeom prst="rect">
+                      <a:avLst/>
+                    </a:prstGeom>
+                  </pic:spPr>
+                </pic:pic>
+              </a:graphicData>
+            </a:graphic>
+          </wp:inline>
+        </w:drawing>
+      </w:r>
+    </w:p>
+    <w:p>
+      <w:pPr>
+        <w:jc w:val="center"/>
+        <w:rPr>
+          <w:i/>
+          <w:sz w:val="18"/>
+        </w:rPr>
+      </w:pPr>
+      <w:r>
+        <w:rPr>
+          <w:i/>
+          <w:sz w:val="18"/>
+        </w:rPr>
+        <w:t xml:space="preserve">Şekil </w:t>
+      </w:r>
+      <w:r>
+        <w:rPr>
+          <w:i/>
+          <w:sz w:val="18"/>
+        </w:rPr>
+        <w:t>3</w:t>
+      </w:r>
+      <w:r>
+        <w:rPr>
+          <w:i/>
+          <w:sz w:val="18"/>
+        </w:rPr>
+        <w:t xml:space="preserve">.1 – </w:t>
+      </w:r>
+      <w:r>
+        <w:rPr>
+          <w:i/>
+          <w:sz w:val="18"/>
+        </w:rPr>
+        <w:t>Yerel osilatör faz gürültüsü ve mikser çıkışına etkisi</w:t>
+      </w:r>
+    </w:p>
+    <w:p>
+      <w:proofErr w:type="spellStart"/>
+      <w:r>
+        <w:t>Spectral</w:t>
+      </w:r>
+      <w:proofErr w:type="spellEnd"/>
+      <w:r>
+        <w:t xml:space="preserve"> </w:t>
+      </w:r>
+      <w:proofErr w:type="spellStart"/>
+      <w:r>
+        <w:t>regrowth’un</w:t>
+      </w:r>
+      <w:proofErr w:type="spellEnd"/>
+      <w:r>
+        <w:t xml:space="preserve"> sonuçları LTE, 5G NR, </w:t>
+      </w:r>
+      <w:proofErr w:type="spellStart"/>
+      <w:r>
+        <w:t>Wi</w:t>
+      </w:r>
+      <w:proofErr w:type="spellEnd"/>
+      <w:r>
+        <w:t xml:space="preserve">-Fi gibi geniş bant aralıklarında rahatlıkla görülebilir. </w:t>
+      </w:r>
+    </w:p>
+    <w:p>
+      <w:pPr>
+        <w:jc w:val="center"/>
+      </w:pPr>
+      <w:r>
+        <w:drawing>
+          <wp:inline distT="0" distB="0" distL="0" distR="0" wp14:anchorId="6EED5367" wp14:editId="5D8622EB">
+            <wp:extent cx="4658264" cy="1804359"/>
+            <wp:effectExtent l="0" t="0" r="0" b="5715"/>
+            <wp:docPr id="17" name="Picture 17"/>
+            <wp:cNvGraphicFramePr>
+              <a:graphicFrameLocks xmlns:a="http://schemas.openxmlformats.org/drawingml/2006/main" noChangeAspect="1"/>
+            </wp:cNvGraphicFramePr>
+            <a:graphic xmlns:a="http://schemas.openxmlformats.org/drawingml/2006/main">
+              <a:graphicData uri="http://schemas.openxmlformats.org/drawingml/2006/picture">
+                <pic:pic xmlns:pic="http://schemas.openxmlformats.org/drawingml/2006/picture">
+                  <pic:nvPicPr>
+                    <pic:cNvPr id="1" name=""/>
+                    <pic:cNvPicPr/>
+                  </pic:nvPicPr>
+                  <pic:blipFill>
+                    <a:blip r:embed="rId11"/>
+                    <a:stretch>
+                      <a:fillRect/>
+                    </a:stretch>
+                  </pic:blipFill>
+                  <pic:spPr>
+                    <a:xfrm>
+                      <a:off x="0" y="0"/>
+                      <a:ext cx="4676504" cy="1811424"/>
+                    </a:xfrm>
+                    <a:prstGeom prst="rect">
+                      <a:avLst/>
+                    </a:prstGeom>
+                  </pic:spPr>
+                </pic:pic>
+              </a:graphicData>
+            </a:graphic>
+          </wp:inline>
+        </w:drawing>
+      </w:r>
+    </w:p>
+    <w:p>
+      <w:pPr>
+        <w:jc w:val="center"/>
+        <w:rPr>
+          <w:i/>
+          <w:sz w:val="18"/>
+        </w:rPr>
+      </w:pPr>
+      <w:r>
+        <w:rPr>
+          <w:i/>
+          <w:sz w:val="18"/>
+        </w:rPr>
+        <w:t xml:space="preserve">Şekil </w:t>
+      </w:r>
+      <w:r>
+        <w:rPr>
+          <w:i/>
+          <w:sz w:val="18"/>
+        </w:rPr>
+        <w:t>3</w:t>
+      </w:r>
+      <w:r>
+        <w:rPr>
+          <w:i/>
+          <w:sz w:val="18"/>
+        </w:rPr>
+        <w:t>.</w:t>
+      </w:r>
+      <w:r>
+        <w:rPr>
+          <w:i/>
+          <w:sz w:val="18"/>
+        </w:rPr>
+        <w:t>2</w:t>
+      </w:r>
+      <w:r>
+        <w:rPr>
+          <w:i/>
+          <w:sz w:val="18"/>
+        </w:rPr>
+        <w:t xml:space="preserve"> – </w:t>
+      </w:r>
+      <w:r>
+        <w:rPr>
+          <w:i/>
+          <w:sz w:val="18"/>
+        </w:rPr>
+        <w:t xml:space="preserve">Farklı faz gürültülerinin </w:t>
+      </w:r>
+      <w:proofErr w:type="spellStart"/>
+      <w:r>
+        <w:rPr>
+          <w:i/>
+          <w:sz w:val="18"/>
+        </w:rPr>
+        <w:t>spectral</w:t>
+      </w:r>
+      <w:proofErr w:type="spellEnd"/>
+      <w:r>
+        <w:rPr>
+          <w:i/>
+          <w:sz w:val="18"/>
+        </w:rPr>
+        <w:t xml:space="preserve"> </w:t>
+      </w:r>
+      <w:proofErr w:type="spellStart"/>
+      <w:r>
+        <w:rPr>
+          <w:i/>
+          <w:sz w:val="18"/>
+        </w:rPr>
+        <w:t>regrowth</w:t>
+      </w:r>
+      <w:proofErr w:type="spellEnd"/>
+      <w:r>
+        <w:rPr>
+          <w:i/>
+          <w:sz w:val="18"/>
+        </w:rPr>
+        <w:t xml:space="preserve"> etkisi</w:t>
+      </w:r>
+    </w:p>
+    <w:p>
+      <w:r>
+        <w:t xml:space="preserve">Eğer </w:t>
+      </w:r>
+      <w:proofErr w:type="spellStart"/>
+      <w:r>
+        <w:t>osilatörün</w:t>
+      </w:r>
+      <w:proofErr w:type="spellEnd"/>
+      <w:r>
+        <w:t xml:space="preserve"> faz gürültüsü düşükse sonuç sinyali yine olması gereken kanalda, çok küçük bir güç kaçağı ile kalır. Ama eğer bu gürültü artarsa sinyali figürdeki kırmızı çizgide de olduğu gibi çok büyük bir </w:t>
+      </w:r>
+      <w:r>
+        <w:t>sızıntı olur ve belirgin bozulmalar görülür.</w:t>
+      </w:r>
+    </w:p>
+    <w:p>
+      <w:pPr>
+        <w:pStyle w:val="Heading2"/>
+      </w:pPr>
+      <w:r>
+        <w:t xml:space="preserve">3.2. </w:t>
+      </w:r>
+      <w:proofErr w:type="spellStart"/>
+      <w:r>
+        <w:t>Reciprocal</w:t>
+      </w:r>
+      <w:proofErr w:type="spellEnd"/>
+      <w:r>
+        <w:t xml:space="preserve"> </w:t>
+      </w:r>
+      <w:proofErr w:type="spellStart"/>
+      <w:r>
+        <w:t>mixing</w:t>
+      </w:r>
+      <w:proofErr w:type="spellEnd"/>
+    </w:p>
+    <w:p>
+      <w:r>
+        <w:t>Faz gürültüsü karşılıklı karıştırma yüzünden de problemlere yol açabilir. Karşılıklı karıştırma, istenen küçük sinyalin, büyük ve istenmeyen bir sinyale yakın olduğu durumlarda ortaya çıkar.</w:t>
+      </w:r>
+    </w:p>
+    <w:p>
+      <w:pPr>
+        <w:jc w:val="center"/>
+      </w:pPr>
+      <w:r>
+        <w:drawing>
+          <wp:inline distT="0" distB="0" distL="0" distR="0" wp14:anchorId="367FE912" wp14:editId="29046081">
+            <wp:extent cx="3657600" cy="1265565"/>
+            <wp:effectExtent l="0" t="0" r="0" b="0"/>
+            <wp:docPr id="18" name="Picture 18"/>
+            <wp:cNvGraphicFramePr>
+              <a:graphicFrameLocks xmlns:a="http://schemas.openxmlformats.org/drawingml/2006/main" noChangeAspect="1"/>
+            </wp:cNvGraphicFramePr>
+            <a:graphic xmlns:a="http://schemas.openxmlformats.org/drawingml/2006/main">
+              <a:graphicData uri="http://schemas.openxmlformats.org/drawingml/2006/picture">
+                <pic:pic xmlns:pic="http://schemas.openxmlformats.org/drawingml/2006/picture">
+                  <pic:nvPicPr>
+                    <pic:cNvPr id="1" name=""/>
+                    <pic:cNvPicPr/>
+                  </pic:nvPicPr>
+                  <pic:blipFill>
+                    <a:blip r:embed="rId12"/>
+                    <a:stretch>
+                      <a:fillRect/>
+                    </a:stretch>
+                  </pic:blipFill>
+                  <pic:spPr>
+                    <a:xfrm>
+                      <a:off x="0" y="0"/>
+                      <a:ext cx="3687372" cy="1275866"/>
+                    </a:xfrm>
+                    <a:prstGeom prst="rect">
+                      <a:avLst/>
+                    </a:prstGeom>
+                  </pic:spPr>
+                </pic:pic>
+              </a:graphicData>
+            </a:graphic>
+          </wp:inline>
+        </w:drawing>
+      </w:r>
+    </w:p>
+    <w:p>
+      <w:pPr>
+        <w:jc w:val="center"/>
+        <w:rPr>
+          <w:i/>
+          <w:sz w:val="18"/>
+        </w:rPr>
+      </w:pPr>
+      <w:r>
+        <w:rPr>
+          <w:i/>
+          <w:sz w:val="18"/>
+        </w:rPr>
+        <w:t xml:space="preserve">Şekil </w:t>
+      </w:r>
+      <w:r>
+        <w:rPr>
+          <w:i/>
+          <w:sz w:val="18"/>
+        </w:rPr>
+        <w:t>3</w:t>
+      </w:r>
+      <w:r>
+        <w:rPr>
+          <w:i/>
+          <w:sz w:val="18"/>
+        </w:rPr>
+        <w:t>.</w:t>
+      </w:r>
+      <w:r>
+        <w:rPr>
+          <w:i/>
+          <w:sz w:val="18"/>
+        </w:rPr>
+        <w:t>3</w:t>
+      </w:r>
+      <w:r>
+        <w:rPr>
+          <w:i/>
+          <w:sz w:val="18"/>
+        </w:rPr>
+        <w:t xml:space="preserve"> – </w:t>
+      </w:r>
+      <w:r>
+        <w:rPr>
+          <w:i/>
+          <w:sz w:val="18"/>
+        </w:rPr>
+        <w:t>Komşu istenmeyen büyük sinyalin IF filtresi ile reddedilmesi</w:t>
+      </w:r>
+    </w:p>
+    <w:p>
+      <w:r>
+        <w:lastRenderedPageBreak/>
+        <w:t>Şekil 3.3’teki durum ideal koşullar için geçerlidir. Gerçek hayatta spektrumlar bu kadar keskin değildir ve faz gürültüsü sebebiyle büyük istenmeyen sinyalin yayılan enerjisi bizim istediğimiz sinyali bastırabilir.</w:t>
+      </w:r>
+    </w:p>
+    <w:p>
+      <w:pPr>
+        <w:jc w:val="center"/>
+      </w:pPr>
+      <w:r>
+        <w:drawing>
+          <wp:inline distT="0" distB="0" distL="0" distR="0" wp14:anchorId="170D9926" wp14:editId="6BA723A1">
+            <wp:extent cx="4304581" cy="1325727"/>
+            <wp:effectExtent l="0" t="0" r="1270" b="8255"/>
+            <wp:docPr id="19" name="Picture 19"/>
+            <wp:cNvGraphicFramePr>
+              <a:graphicFrameLocks xmlns:a="http://schemas.openxmlformats.org/drawingml/2006/main" noChangeAspect="1"/>
+            </wp:cNvGraphicFramePr>
+            <a:graphic xmlns:a="http://schemas.openxmlformats.org/drawingml/2006/main">
+              <a:graphicData uri="http://schemas.openxmlformats.org/drawingml/2006/picture">
+                <pic:pic xmlns:pic="http://schemas.openxmlformats.org/drawingml/2006/picture">
+                  <pic:nvPicPr>
+                    <pic:cNvPr id="1" name=""/>
+                    <pic:cNvPicPr/>
+                  </pic:nvPicPr>
+                  <pic:blipFill>
+                    <a:blip r:embed="rId13"/>
+                    <a:stretch>
+                      <a:fillRect/>
+                    </a:stretch>
+                  </pic:blipFill>
+                  <pic:spPr>
+                    <a:xfrm>
+                      <a:off x="0" y="0"/>
+                      <a:ext cx="4313072" cy="1328342"/>
+                    </a:xfrm>
+                    <a:prstGeom prst="rect">
+                      <a:avLst/>
+                    </a:prstGeom>
+                  </pic:spPr>
+                </pic:pic>
+              </a:graphicData>
+            </a:graphic>
+          </wp:inline>
+        </w:drawing>
+      </w:r>
+    </w:p>
+    <w:p>
+      <w:pPr>
+        <w:jc w:val="center"/>
+        <w:rPr>
+          <w:i/>
+          <w:sz w:val="18"/>
+        </w:rPr>
+      </w:pPr>
+      <w:r>
+        <w:rPr>
+          <w:i/>
+          <w:sz w:val="18"/>
+        </w:rPr>
+        <w:t xml:space="preserve">Şekil </w:t>
+      </w:r>
+      <w:r>
+        <w:rPr>
+          <w:i/>
+          <w:sz w:val="18"/>
+        </w:rPr>
+        <w:t>3</w:t>
+      </w:r>
+      <w:r>
+        <w:rPr>
+          <w:i/>
+          <w:sz w:val="18"/>
+        </w:rPr>
+        <w:t>.</w:t>
+      </w:r>
+      <w:r>
+        <w:rPr>
+          <w:i/>
+          <w:sz w:val="18"/>
+        </w:rPr>
+        <w:t>3</w:t>
+      </w:r>
+      <w:r>
+        <w:rPr>
+          <w:i/>
+          <w:sz w:val="18"/>
+        </w:rPr>
+        <w:t xml:space="preserve"> – </w:t>
+      </w:r>
+      <w:r>
+        <w:rPr>
+          <w:i/>
+          <w:sz w:val="18"/>
+        </w:rPr>
+        <w:t>Komşu istenmeyen büyük sinyalin istenen sinyali bastırması</w:t>
+      </w:r>
+    </w:p>
+    <w:p>
+      <w:pPr>
+        <w:jc w:val="center"/>
+        <w:rPr>
+          <w:i/>
+          <w:sz w:val="18"/>
+        </w:rPr>
+      </w:pPr>
+    </w:p>
+    <w:p>
+      <w:pPr>
+        <w:jc w:val="center"/>
+        <w:rPr>
+          <w:i/>
+          <w:sz w:val="18"/>
+        </w:rPr>
+      </w:pPr>
+    </w:p>
+    <w:p>
+      <w:pPr>
+        <w:pStyle w:val="Heading2"/>
+      </w:pPr>
+      <w:r>
+        <w:t>3.3. Faz gürültüsü ve haberleşme sistemleri</w:t>
+      </w:r>
+    </w:p>
+    <w:p>
+      <w:r>
+        <w:t xml:space="preserve">Faz gürültüsü özellikle faz modülasyonu kullanan haberleşme sistemleri için de problemler yaratabilir. Çoğu modern yüksek veri hızı sağlayan kablosuz teknolojiler, </w:t>
+      </w:r>
+      <w:r>
+        <w:t xml:space="preserve">APSK veya QAM gibi faz ve genlik modülasyonu modülasyon şemaları kullanır. Bu modülasyon şemaları sıklıkla </w:t>
+      </w:r>
+      <w:proofErr w:type="spellStart"/>
+      <w:r>
+        <w:t>constellation</w:t>
+      </w:r>
+      <w:proofErr w:type="spellEnd"/>
+      <w:r>
+        <w:t xml:space="preserve"> </w:t>
+      </w:r>
+      <w:proofErr w:type="spellStart"/>
+      <w:r>
+        <w:t>diagram’lar</w:t>
+      </w:r>
+      <w:proofErr w:type="spellEnd"/>
+      <w:r>
+        <w:t xml:space="preserve"> ile sunulur. Bu diyagramlardaki her bir nokta bir sembolü temsil eder, genlik ve faz bilgisi taşırlar.</w:t>
+      </w:r>
+    </w:p>
+    <w:p/>
+    <w:p>
+      <w:pPr>
+        <w:jc w:val="center"/>
+      </w:pPr>
+      <w:bookmarkStart w:id="0" w:name="_GoBack"/>
+      <w:r>
+        <w:drawing>
+          <wp:inline distT="0" distB="0" distL="0" distR="0" wp14:anchorId="4F93103A" wp14:editId="351BC8F0">
+            <wp:extent cx="2357565" cy="2353901"/>
+            <wp:effectExtent l="0" t="0" r="5080" b="8890"/>
+            <wp:docPr id="21" name="Picture 21"/>
+            <wp:cNvGraphicFramePr>
+              <a:graphicFrameLocks xmlns:a="http://schemas.openxmlformats.org/drawingml/2006/main" noChangeAspect="1"/>
+            </wp:cNvGraphicFramePr>
+            <a:graphic xmlns:a="http://schemas.openxmlformats.org/drawingml/2006/main">
+              <a:graphicData uri="http://schemas.openxmlformats.org/drawingml/2006/picture">
+                <pic:pic xmlns:pic="http://schemas.openxmlformats.org/drawingml/2006/picture">
+                  <pic:nvPicPr>
+                    <pic:cNvPr id="1" name=""/>
+                    <pic:cNvPicPr/>
+                  </pic:nvPicPr>
+                  <pic:blipFill rotWithShape="1">
+                    <a:blip r:embed="rId14"/>
+                    <a:srcRect l="3846" t="935" r="5113" b="1838"/>
+                    <a:stretch/>
+                  </pic:blipFill>
+                  <pic:spPr bwMode="auto">
+                    <a:xfrm>
+                      <a:off x="0" y="0"/>
+                      <a:ext cx="2365977" cy="2362300"/>
+                    </a:xfrm>
+                    <a:prstGeom prst="rect">
+                      <a:avLst/>
+                    </a:prstGeom>
+                    <a:ln>
+                      <a:noFill/>
+                    </a:ln>
+                    <a:extLst>
+                      <a:ext uri="{53640926-AAD7-44D8-BBD7-CCE9431645EC}">
+                        <a14:shadowObscured xmlns:a14="http://schemas.microsoft.com/office/drawing/2010/main"/>
+                      </a:ext>
+                    </a:extLst>
+                  </pic:spPr>
+                </pic:pic>
+              </a:graphicData>
+            </a:graphic>
+          </wp:inline>
+        </w:drawing>
+      </w:r>
+      <w:bookmarkEnd w:id="0"/>
+      <w:r>
+        <w:tab/>
+      </w:r>
+      <w:r>
+        <w:drawing>
+          <wp:inline distT="0" distB="0" distL="0" distR="0" wp14:anchorId="254E305A" wp14:editId="1D4D55D3">
+            <wp:extent cx="2352020" cy="2355574"/>
+            <wp:effectExtent l="0" t="0" r="0" b="6985"/>
+            <wp:docPr id="22" name="Picture 22"/>
+            <wp:cNvGraphicFramePr>
+              <a:graphicFrameLocks xmlns:a="http://schemas.openxmlformats.org/drawingml/2006/main" noChangeAspect="1"/>
+            </wp:cNvGraphicFramePr>
+            <a:graphic xmlns:a="http://schemas.openxmlformats.org/drawingml/2006/main">
+              <a:graphicData uri="http://schemas.openxmlformats.org/drawingml/2006/picture">
+                <pic:pic xmlns:pic="http://schemas.openxmlformats.org/drawingml/2006/picture">
+                  <pic:nvPicPr>
+                    <pic:cNvPr id="1" name=""/>
+                    <pic:cNvPicPr/>
+                  </pic:nvPicPr>
+                  <pic:blipFill rotWithShape="1">
+                    <a:blip r:embed="rId15"/>
+                    <a:srcRect l="2396" t="2036" r="3772" b="3567"/>
+                    <a:stretch/>
+                  </pic:blipFill>
+                  <pic:spPr bwMode="auto">
+                    <a:xfrm>
+                      <a:off x="0" y="0"/>
+                      <a:ext cx="2388544" cy="2392153"/>
+                    </a:xfrm>
+                    <a:prstGeom prst="rect">
+                      <a:avLst/>
+                    </a:prstGeom>
+                    <a:ln>
+                      <a:noFill/>
+                    </a:ln>
+                    <a:extLst>
+                      <a:ext uri="{53640926-AAD7-44D8-BBD7-CCE9431645EC}">
+                        <a14:shadowObscured xmlns:a14="http://schemas.microsoft.com/office/drawing/2010/main"/>
+                      </a:ext>
+                    </a:extLst>
+                  </pic:spPr>
+                </pic:pic>
+              </a:graphicData>
+            </a:graphic>
+          </wp:inline>
+        </w:drawing>
+      </w:r>
+    </w:p>
+    <w:p>
+      <w:pPr>
+        <w:jc w:val="center"/>
+        <w:rPr>
+          <w:i/>
+          <w:sz w:val="18"/>
+        </w:rPr>
+      </w:pPr>
+      <w:r>
+        <w:rPr>
+          <w:i/>
+          <w:sz w:val="18"/>
+        </w:rPr>
+        <w:t xml:space="preserve">Şekil </w:t>
+      </w:r>
+      <w:r>
+        <w:rPr>
+          <w:i/>
+          <w:sz w:val="18"/>
+        </w:rPr>
+        <w:t>3</w:t>
+      </w:r>
+      <w:r>
+        <w:rPr>
+          <w:i/>
+          <w:sz w:val="18"/>
+        </w:rPr>
+        <w:t>.</w:t>
+      </w:r>
+      <w:r>
+        <w:rPr>
+          <w:i/>
+          <w:sz w:val="18"/>
+        </w:rPr>
+        <w:t>4</w:t>
+      </w:r>
+      <w:r>
+        <w:rPr>
+          <w:i/>
+          <w:sz w:val="18"/>
+        </w:rPr>
+        <w:t xml:space="preserve"> – </w:t>
+      </w:r>
+      <w:r>
+        <w:rPr>
+          <w:i/>
+          <w:sz w:val="18"/>
+        </w:rPr>
+        <w:t xml:space="preserve">16QAM </w:t>
+      </w:r>
+      <w:proofErr w:type="spellStart"/>
+      <w:r>
+        <w:rPr>
+          <w:i/>
+          <w:sz w:val="18"/>
+        </w:rPr>
+        <w:t>constellation</w:t>
+      </w:r>
+      <w:proofErr w:type="spellEnd"/>
+      <w:r>
+        <w:rPr>
+          <w:i/>
+          <w:sz w:val="18"/>
+        </w:rPr>
+        <w:t xml:space="preserve"> diyagramı ve faz gürültüsünün etkisi</w:t>
+      </w:r>
+    </w:p>
+    <w:p>
+      <w:pPr>
+        <w:jc w:val="center"/>
+      </w:pPr>
+    </w:p>
+    <w:p>
+      <w:pPr>
+        <w:jc w:val="center"/>
+      </w:pPr>
+    </w:p>
+    <w:p>
+      <w:pPr>
+        <w:jc w:val="center"/>
+      </w:pPr>
+    </w:p>
+    <w:p>
+      <w:pPr>
+        <w:jc w:val="center"/>
+      </w:pPr>
+    </w:p>
+    <w:p>
+      <w:pPr>
+        <w:jc w:val="center"/>
+      </w:pPr>
+    </w:p>
+    <w:p>
+      <w:pPr>
+        <w:jc w:val="center"/>
+      </w:pPr>
+    </w:p>
+    <w:p>
+      <w:pPr>
+        <w:pStyle w:val="Heading1"/>
+        <w:numPr>
+          <w:ilvl w:val="0"/>
+          <w:numId w:val="1"/>
+        </w:numPr>
+        <w:rPr>
+          <w:rFonts w:eastAsiaTheme="minorEastAsia"/>
+          <w:b/>
+        </w:rPr>
+      </w:pPr>
+      <w:r>
+        <w:rPr>
+          <w:rFonts w:eastAsiaTheme="minorEastAsia"/>
+          <w:b/>
+        </w:rPr>
+        <w:lastRenderedPageBreak/>
         <w:t>Faz Gürültüsü Çeşitleri</w:t>
       </w:r>
     </w:p>
@@ -1323,7 +2119,10 @@
         <w:pStyle w:val="Heading2"/>
       </w:pPr>
       <w:r>
-        <w:t>3.</w:t>
+        <w:t>4</w:t>
+      </w:r>
+      <w:r>
+        <w:t>.</w:t>
       </w:r>
       <w:r>
         <w:t>1</w:t>
@@ -1790,7 +2589,15 @@
               <w:cnfStyle w:val="000000100000" w:firstRow="0" w:lastRow="0" w:firstColumn="0" w:lastColumn="0" w:oddVBand="0" w:evenVBand="0" w:oddHBand="1" w:evenHBand="0" w:firstRowFirstColumn="0" w:firstRowLastColumn="0" w:lastRowFirstColumn="0" w:lastRowLastColumn="0"/>
             </w:pPr>
             <w:r>
-              <w:t>−40 db/</w:t>
+              <w:t xml:space="preserve">−40 </w:t>
+            </w:r>
+            <w:proofErr w:type="spellStart"/>
+            <w:r>
+              <w:t>db</w:t>
+            </w:r>
+            <w:proofErr w:type="spellEnd"/>
+            <w:r>
+              <w:t>/</w:t>
             </w:r>
             <w:proofErr w:type="spellStart"/>
             <w:r>
@@ -1900,7 +2707,15 @@
               <w:cnfStyle w:val="000000000000" w:firstRow="0" w:lastRow="0" w:firstColumn="0" w:lastColumn="0" w:oddVBand="0" w:evenVBand="0" w:oddHBand="0" w:evenHBand="0" w:firstRowFirstColumn="0" w:firstRowLastColumn="0" w:lastRowFirstColumn="0" w:lastRowLastColumn="0"/>
             </w:pPr>
             <w:r>
-              <w:t>−30 db/</w:t>
+              <w:t xml:space="preserve">−30 </w:t>
+            </w:r>
+            <w:proofErr w:type="spellStart"/>
+            <w:r>
+              <w:t>db</w:t>
+            </w:r>
+            <w:proofErr w:type="spellEnd"/>
+            <w:r>
+              <w:t>/</w:t>
             </w:r>
             <w:proofErr w:type="spellStart"/>
             <w:r>
@@ -2008,7 +2823,15 @@
               <w:cnfStyle w:val="000000100000" w:firstRow="0" w:lastRow="0" w:firstColumn="0" w:lastColumn="0" w:oddVBand="0" w:evenVBand="0" w:oddHBand="1" w:evenHBand="0" w:firstRowFirstColumn="0" w:firstRowLastColumn="0" w:lastRowFirstColumn="0" w:lastRowLastColumn="0"/>
             </w:pPr>
             <w:r>
-              <w:t>−20 db/</w:t>
+              <w:t xml:space="preserve">−20 </w:t>
+            </w:r>
+            <w:proofErr w:type="spellStart"/>
+            <w:r>
+              <w:t>db</w:t>
+            </w:r>
+            <w:proofErr w:type="spellEnd"/>
+            <w:r>
+              <w:t>/</w:t>
             </w:r>
             <w:proofErr w:type="spellStart"/>
             <w:r>
@@ -2095,7 +2918,15 @@
               <w:cnfStyle w:val="000000000000" w:firstRow="0" w:lastRow="0" w:firstColumn="0" w:lastColumn="0" w:oddVBand="0" w:evenVBand="0" w:oddHBand="0" w:evenHBand="0" w:firstRowFirstColumn="0" w:firstRowLastColumn="0" w:lastRowFirstColumn="0" w:lastRowLastColumn="0"/>
             </w:pPr>
             <w:r>
-              <w:t>−10 db/</w:t>
+              <w:t xml:space="preserve">−10 </w:t>
+            </w:r>
+            <w:proofErr w:type="spellStart"/>
+            <w:r>
+              <w:t>db</w:t>
+            </w:r>
+            <w:proofErr w:type="spellEnd"/>
+            <w:r>
+              <w:t>/</w:t>
             </w:r>
             <w:proofErr w:type="spellStart"/>
             <w:r>
@@ -2171,7 +3002,15 @@
               <w:cnfStyle w:val="000000100000" w:firstRow="0" w:lastRow="0" w:firstColumn="0" w:lastColumn="0" w:oddVBand="0" w:evenVBand="0" w:oddHBand="1" w:evenHBand="0" w:firstRowFirstColumn="0" w:firstRowLastColumn="0" w:lastRowFirstColumn="0" w:lastRowLastColumn="0"/>
             </w:pPr>
             <w:r>
-              <w:t>0 db/</w:t>
+              <w:t xml:space="preserve">0 </w:t>
+            </w:r>
+            <w:proofErr w:type="spellStart"/>
+            <w:r>
+              <w:t>db</w:t>
+            </w:r>
+            <w:proofErr w:type="spellEnd"/>
+            <w:r>
+              <w:t>/</w:t>
             </w:r>
             <w:proofErr w:type="spellStart"/>
             <w:r>
@@ -2229,7 +3068,7 @@
                     <pic:cNvPicPr/>
                   </pic:nvPicPr>
                   <pic:blipFill>
-                    <a:blip r:embed="rId9"/>
+                    <a:blip r:embed="rId16"/>
                     <a:stretch>
                       <a:fillRect/>
                     </a:stretch>
@@ -2270,7 +3109,7 @@
           <w:i/>
           <w:sz w:val="18"/>
         </w:rPr>
-        <w:t>2</w:t>
+        <w:t>4</w:t>
       </w:r>
       <w:r>
         <w:rPr>
@@ -2411,7 +3250,10 @@
         <w:pStyle w:val="Heading2"/>
       </w:pPr>
       <w:r>
-        <w:t>3.2. Ölçüm türüne göre</w:t>
+        <w:t>4</w:t>
+      </w:r>
+      <w:r>
+        <w:t>.2. Ölçüm türüne göre</w:t>
       </w:r>
     </w:p>
     <w:p>
@@ -2470,7 +3312,10 @@
         <w:pStyle w:val="Heading2"/>
       </w:pPr>
       <w:r>
-        <w:t>4.1. Doğrudan spektral analiz</w:t>
+        <w:t>5</w:t>
+      </w:r>
+      <w:r>
+        <w:t>.1. Doğrudan spektral analiz</w:t>
       </w:r>
     </w:p>
     <w:p>
@@ -2513,7 +3358,7 @@
                     <pic:cNvPicPr/>
                   </pic:nvPicPr>
                   <pic:blipFill>
-                    <a:blip r:embed="rId10"/>
+                    <a:blip r:embed="rId17"/>
                     <a:stretch>
                       <a:fillRect/>
                     </a:stretch>
@@ -2547,7 +3392,21 @@
           <w:i/>
           <w:sz w:val="18"/>
         </w:rPr>
-        <w:t>Şekil 4.1 – Spektrum Analiz Cihazı</w:t>
+        <w:t xml:space="preserve">Şekil </w:t>
+      </w:r>
+      <w:r>
+        <w:rPr>
+          <w:i/>
+          <w:sz w:val="18"/>
+        </w:rPr>
+        <w:t>5</w:t>
+      </w:r>
+      <w:r>
+        <w:rPr>
+          <w:i/>
+          <w:sz w:val="18"/>
+        </w:rPr>
+        <w:t>.1 – Spektrum Analiz Cihazı</w:t>
       </w:r>
     </w:p>
     <w:p>
@@ -2563,7 +3422,10 @@
         <w:pStyle w:val="Heading2"/>
       </w:pPr>
       <w:r>
-        <w:t xml:space="preserve">4.2. Faz </w:t>
+        <w:t>5</w:t>
+      </w:r>
+      <w:r>
+        <w:t xml:space="preserve">.2. Faz </w:t>
       </w:r>
       <w:r>
         <w:t>d</w:t>
@@ -2864,7 +3726,7 @@
                     <pic:cNvPicPr/>
                   </pic:nvPicPr>
                   <pic:blipFill>
-                    <a:blip r:embed="rId11"/>
+                    <a:blip r:embed="rId18"/>
                     <a:stretch>
                       <a:fillRect/>
                     </a:stretch>
@@ -2898,7 +3760,21 @@
           <w:i/>
           <w:sz w:val="18"/>
         </w:rPr>
-        <w:t>Şekil 4.</w:t>
+        <w:t xml:space="preserve">Şekil </w:t>
+      </w:r>
+      <w:r>
+        <w:rPr>
+          <w:i/>
+          <w:sz w:val="18"/>
+        </w:rPr>
+        <w:t>5</w:t>
+      </w:r>
+      <w:r>
+        <w:rPr>
+          <w:i/>
+          <w:sz w:val="18"/>
+        </w:rPr>
+        <w:t>.</w:t>
       </w:r>
       <w:r>
         <w:rPr>
@@ -2928,9 +3804,12 @@
       </w:pPr>
       <w:r>
         <w:lastRenderedPageBreak/>
-        <w:t xml:space="preserve">4.3. </w:t>
-      </w:r>
-      <w:bookmarkStart w:id="0" w:name="_Hlk238195047"/>
+        <w:t>5</w:t>
+      </w:r>
+      <w:r>
+        <w:t xml:space="preserve">.3. </w:t>
+      </w:r>
+      <w:bookmarkStart w:id="1" w:name="_Hlk238195047"/>
       <w:r>
         <w:t>Cross-</w:t>
       </w:r>
@@ -2952,7 +3831,7 @@
       <w:r>
         <w:t xml:space="preserve">etektörü </w:t>
       </w:r>
-      <w:bookmarkEnd w:id="0"/>
+      <w:bookmarkEnd w:id="1"/>
       <w:r>
         <w:t>y</w:t>
       </w:r>
@@ -3834,7 +4713,7 @@
                     <pic:cNvPicPr/>
                   </pic:nvPicPr>
                   <pic:blipFill>
-                    <a:blip r:embed="rId12"/>
+                    <a:blip r:embed="rId19"/>
                     <a:stretch>
                       <a:fillRect/>
                     </a:stretch>
@@ -3868,7 +4747,21 @@
           <w:i/>
           <w:sz w:val="18"/>
         </w:rPr>
-        <w:t>Şekil 4.</w:t>
+        <w:t xml:space="preserve">Şekil </w:t>
+      </w:r>
+      <w:r>
+        <w:rPr>
+          <w:i/>
+          <w:sz w:val="18"/>
+        </w:rPr>
+        <w:t>5</w:t>
+      </w:r>
+      <w:r>
+        <w:rPr>
+          <w:i/>
+          <w:sz w:val="18"/>
+        </w:rPr>
+        <w:t>.</w:t>
       </w:r>
       <w:r>
         <w:rPr>
@@ -3889,7 +4782,23 @@
           <w:i/>
           <w:sz w:val="18"/>
         </w:rPr>
-        <w:t xml:space="preserve">Cross-Correlation ile Faz Detektörü </w:t>
+        <w:t>Cross-</w:t>
+      </w:r>
+      <w:proofErr w:type="spellStart"/>
+      <w:r>
+        <w:rPr>
+          <w:i/>
+          <w:sz w:val="18"/>
+        </w:rPr>
+        <w:t>Correlation</w:t>
+      </w:r>
+      <w:proofErr w:type="spellEnd"/>
+      <w:r>
+        <w:rPr>
+          <w:i/>
+          <w:sz w:val="18"/>
+        </w:rPr>
+        <w:t xml:space="preserve"> ile Faz Detektörü </w:t>
       </w:r>
       <w:r>
         <w:rPr>
@@ -3905,7 +4814,10 @@
         <w:pStyle w:val="Heading2"/>
       </w:pPr>
       <w:r>
-        <w:t xml:space="preserve">4.4. Diğer </w:t>
+        <w:t>5</w:t>
+      </w:r>
+      <w:r>
+        <w:t xml:space="preserve">.4. Diğer </w:t>
       </w:r>
       <w:r>
         <w:t>y</w:t>
@@ -4007,7 +4919,7 @@
                     </pic:cNvPicPr>
                   </pic:nvPicPr>
                   <pic:blipFill>
-                    <a:blip r:embed="rId13">
+                    <a:blip r:embed="rId20">
                       <a:extLst>
                         <a:ext uri="{28A0092B-C50C-407E-A947-70E740481C1C}">
                           <a14:useLocalDpi xmlns:a14="http://schemas.microsoft.com/office/drawing/2010/main" val="0"/>
@@ -4051,7 +4963,21 @@
           <w:i/>
           <w:sz w:val="18"/>
         </w:rPr>
-        <w:t>Şekil 5.1</w:t>
+        <w:t>Şekil</w:t>
+      </w:r>
+      <w:r>
+        <w:rPr>
+          <w:i/>
+          <w:sz w:val="18"/>
+        </w:rPr>
+        <w:t xml:space="preserve"> 6</w:t>
+      </w:r>
+      <w:r>
+        <w:rPr>
+          <w:i/>
+          <w:sz w:val="18"/>
+        </w:rPr>
+        <w:t>.1</w:t>
       </w:r>
       <w:r>
         <w:rPr>
@@ -4086,12 +5012,21 @@
       </w:pPr>
       <w:r>
         <w:lastRenderedPageBreak/>
-        <w:t>5.1. Gürültü ve taşıyıcı üretimi</w:t>
-      </w:r>
-    </w:p>
-    <w:p>
-      <w:r>
-        <w:t xml:space="preserve">Her iterasyonda yeni bir DUT faz dizisi ile iki ayrı referans faz dizisi üretilir. Aynı DUT taşıyıcı iki ölçüm kanalına uygulanır. Referansların merkez fazına </w:t>
+        <w:t>6</w:t>
+      </w:r>
+      <w:r>
+        <w:t>.1. Gürültü ve taşıyıcı üretimi</w:t>
+      </w:r>
+    </w:p>
+    <w:p>
+      <w:r>
+        <w:t>Her iterasyonda yeni bir DUT faz dizisi ile iki ayrı referans faz dizisi üretilir. Aynı DUT taşıyıcı iki ölçüm kanalına uygulanır. Referansların merkez fazına</w:t>
+      </w:r>
+      <w:r>
+        <w:t xml:space="preserve"> </w:t>
+      </w:r>
+      <w:r>
+        <w:t xml:space="preserve"> </w:t>
       </w:r>
       <m:oMath>
         <m:f>
@@ -4125,6 +5060,12 @@
         <w:rPr>
           <w:rFonts w:eastAsiaTheme="minorEastAsia"/>
         </w:rPr>
+        <w:t xml:space="preserve"> </w:t>
+      </w:r>
+      <w:r>
+        <w:rPr>
+          <w:rFonts w:eastAsiaTheme="minorEastAsia"/>
+        </w:rPr>
         <w:t xml:space="preserve"> eklenir. </w:t>
       </w:r>
       <w:r>
@@ -4153,13 +5094,14 @@
         <w:pStyle w:val="Heading2"/>
       </w:pPr>
       <w:r>
-        <w:t xml:space="preserve">5.2. Mikser, LPF ve faz </w:t>
-      </w:r>
-      <w:proofErr w:type="spellStart"/>
-      <w:r>
-        <w:t>dedektörü</w:t>
-      </w:r>
-      <w:proofErr w:type="spellEnd"/>
+        <w:t>6</w:t>
+      </w:r>
+      <w:r>
+        <w:t xml:space="preserve">.2. Mikser, LPF ve faz </w:t>
+      </w:r>
+      <w:r>
+        <w:t>detektörü</w:t>
+      </w:r>
       <w:r>
         <w:t xml:space="preserve"> kazancı</w:t>
       </w:r>
@@ -5425,7 +6367,10 @@
         <w:pStyle w:val="Heading2"/>
       </w:pPr>
       <w:r>
-        <w:t>5.3. Kompleks Cross-PSD ve doğrusal ortalama</w:t>
+        <w:t>6</w:t>
+      </w:r>
+      <w:r>
+        <w:t>.3. Kompleks Cross-PSD ve doğrusal ortalama</w:t>
       </w:r>
     </w:p>
     <w:p>
@@ -5641,7 +6586,10 @@
         <w:pStyle w:val="Heading2"/>
       </w:pPr>
       <w:r>
-        <w:t>5.4.</w:t>
+        <w:t>6</w:t>
+      </w:r>
+      <w:r>
+        <w:t>.4.</w:t>
       </w:r>
       <w:r>
         <w:t xml:space="preserve"> Logaritmik binleme ve değerlendirme metriği</w:t>
@@ -5673,18 +6621,15 @@
       </w:r>
       <w:proofErr w:type="spellEnd"/>
       <w:r>
-        <w:t xml:space="preserve"> sonra hesaplanan ortalama mutlak </w:t>
-      </w:r>
-      <w:proofErr w:type="spellStart"/>
-      <w:r>
-        <w:t>dB</w:t>
-      </w:r>
-      <w:proofErr w:type="spellEnd"/>
-      <w:r>
-        <w:t xml:space="preserve"> farkıdır:</w:t>
-      </w:r>
-    </w:p>
-    <w:p>
+        <w:t xml:space="preserve"> sonra hesaplanan ortalama mutlak dB farkıdır:</w:t>
+      </w:r>
+    </w:p>
+    <w:p>
+      <w:pPr>
+        <w:rPr>
+          <w:rFonts w:eastAsiaTheme="minorEastAsia"/>
+        </w:rPr>
+      </w:pPr>
       <m:oMathPara>
         <m:oMath>
           <m:r>
@@ -5700,19 +6645,7 @@
             <w:rPr>
               <w:rFonts w:ascii="Cambria Math" w:hAnsi="Cambria Math"/>
             </w:rPr>
-            <m:t>=(1/</m:t>
-          </m:r>
-          <m:r>
-            <w:rPr>
-              <w:rFonts w:ascii="Cambria Math" w:hAnsi="Cambria Math"/>
-            </w:rPr>
-            <m:t>J</m:t>
-          </m:r>
-          <m:r>
-            <w:rPr>
-              <w:rFonts w:ascii="Cambria Math" w:hAnsi="Cambria Math"/>
-            </w:rPr>
-            <m:t>)</m:t>
+            <m:t>=(1/J)</m:t>
           </m:r>
           <m:nary>
             <m:naryPr>
@@ -5887,17 +6820,17 @@
         </m:oMath>
       </m:oMathPara>
     </w:p>
+    <w:p/>
     <w:p>
       <w:pPr>
         <w:pStyle w:val="Heading2"/>
       </w:pPr>
-    </w:p>
-    <w:p>
-      <w:pPr>
-        <w:pStyle w:val="Heading2"/>
-      </w:pPr>
-      <w:r>
-        <w:t>5.</w:t>
+      <w:r>
+        <w:lastRenderedPageBreak/>
+        <w:t>6</w:t>
+      </w:r>
+      <w:r>
+        <w:t>.</w:t>
       </w:r>
       <w:r>
         <w:t>5</w:t>
@@ -6044,7 +6977,13 @@
       </w:r>
       <w:proofErr w:type="spellEnd"/>
       <w:r>
-        <w:t xml:space="preserve"> karşılaştırıldı. Karşılaştırmada SSB faz gürültüsü, ortalama genlik hatası ve faz detektörü düzeltme katsayısı kullanıldı.</w:t>
+        <w:t xml:space="preserve"> karşılaştırıldı. Karşılaştırmada SSB faz gürültüsü</w:t>
+      </w:r>
+      <w:r>
+        <w:t xml:space="preserve"> ve</w:t>
+      </w:r>
+      <w:r>
+        <w:t xml:space="preserve"> ortalama genlik hatası kullanıldı.</w:t>
       </w:r>
     </w:p>
     <w:p/>
@@ -6074,7 +7013,10 @@
         <w:pStyle w:val="Heading2"/>
       </w:pPr>
       <w:r>
-        <w:t>6.1 Modelin fonksiyon akışı</w:t>
+        <w:t>7</w:t>
+      </w:r>
+      <w:r>
+        <w:t>.1 Modelin fonksiyon akışı</w:t>
       </w:r>
     </w:p>
     <w:p>
@@ -6090,7 +7032,7 @@
         </w:rPr>
         <w:drawing>
           <wp:inline distT="0" distB="0" distL="0" distR="0">
-            <wp:extent cx="5701464" cy="3762375"/>
+            <wp:extent cx="5353050" cy="3532457"/>
             <wp:effectExtent l="0" t="0" r="0" b="0"/>
             <wp:docPr id="9" name="Picture 9"/>
             <wp:cNvGraphicFramePr>
@@ -6106,7 +7048,7 @@
                     </pic:cNvPicPr>
                   </pic:nvPicPr>
                   <pic:blipFill>
-                    <a:blip r:embed="rId14">
+                    <a:blip r:embed="rId21">
                       <a:extLst>
                         <a:ext uri="{28A0092B-C50C-407E-A947-70E740481C1C}">
                           <a14:useLocalDpi xmlns:a14="http://schemas.microsoft.com/office/drawing/2010/main" val="0"/>
@@ -6121,7 +7063,7 @@
                   <pic:spPr bwMode="auto">
                     <a:xfrm>
                       <a:off x="0" y="0"/>
-                      <a:ext cx="5715982" cy="3771955"/>
+                      <a:ext cx="5374090" cy="3546341"/>
                     </a:xfrm>
                     <a:prstGeom prst="rect">
                       <a:avLst/>
@@ -6151,7 +7093,21 @@
           <w:i/>
           <w:sz w:val="18"/>
         </w:rPr>
-        <w:t xml:space="preserve">Şekil 6.1 </w:t>
+        <w:t xml:space="preserve">Şekil </w:t>
+      </w:r>
+      <w:r>
+        <w:rPr>
+          <w:i/>
+          <w:sz w:val="18"/>
+        </w:rPr>
+        <w:t>7</w:t>
+      </w:r>
+      <w:r>
+        <w:rPr>
+          <w:i/>
+          <w:sz w:val="18"/>
+        </w:rPr>
+        <w:t xml:space="preserve">.1 </w:t>
       </w:r>
       <w:r>
         <w:rPr>
@@ -6176,87 +7132,92 @@
       </w:r>
     </w:p>
     <w:p>
+      <w:r>
+        <w:rPr>
+          <w:rFonts w:ascii="Cascadia Mono SemiLight" w:hAnsi="Cascadia Mono SemiLight"/>
+          <w:sz w:val="20"/>
+        </w:rPr>
+        <w:t>run_comparisons.m</w:t>
+      </w:r>
+      <w:r>
+        <w:t xml:space="preserve"> </w:t>
+      </w:r>
+      <w:r>
+        <w:t xml:space="preserve">test edilecek parametreleri tanımlarken </w:t>
+      </w:r>
       <w:proofErr w:type="spellStart"/>
       <w:r>
         <w:rPr>
           <w:rFonts w:ascii="Cascadia Mono SemiLight" w:hAnsi="Cascadia Mono SemiLight"/>
-          <w:highlight w:val="lightGray"/>
-        </w:rPr>
-        <w:t>run_comparisons.m</w:t>
+          <w:sz w:val="20"/>
+        </w:rPr>
+        <w:t>run_comparisons_main.m</w:t>
       </w:r>
       <w:proofErr w:type="spellEnd"/>
       <w:r>
+        <w:t xml:space="preserve"> her değeri bağımsız olarak çalıştırmakta ve sonuçları kaydetmektedir. Ana hesaplamalar </w:t>
+      </w:r>
+      <w:proofErr w:type="spellStart"/>
+      <w:r>
+        <w:rPr>
+          <w:rFonts w:ascii="Cascadia Mono SemiLight" w:hAnsi="Cascadia Mono SemiLight"/>
+          <w:sz w:val="20"/>
+        </w:rPr>
+        <w:t>run_simulation.m</w:t>
+      </w:r>
+      <w:proofErr w:type="spellEnd"/>
+      <w:r>
+        <w:t xml:space="preserve"> içinde gerçekleştirilmektedir.</w:t>
+      </w:r>
+    </w:p>
+    <w:p>
+      <w:r>
+        <w:t xml:space="preserve">Güncel kodda her iterasyonda yeni bir DUT, Ref1 ve Ref2 realizasyonu oluşturulmaktadır. Aynı </w:t>
+      </w:r>
+      <w:proofErr w:type="spellStart"/>
+      <w:r>
+        <w:t>iterasyondaki</w:t>
+      </w:r>
+      <w:proofErr w:type="spellEnd"/>
+      <w:r>
+        <w:t xml:space="preserve"> iki kanal ortak DUT realizasyonunu kullanırken referans realizasyonları birbirinden bağımsızdır.</w:t>
+      </w:r>
+    </w:p>
+    <w:p>
+      <w:pPr>
+        <w:pStyle w:val="Heading2"/>
+      </w:pPr>
+      <w:r>
+        <w:t>7</w:t>
+      </w:r>
+      <w:r>
+        <w:t>.2. Yapılan optimizasyonlar</w:t>
+      </w:r>
+    </w:p>
+    <w:p>
+      <w:r>
+        <w:t>Daha önce 5.2’de bahsedildiği gibi projenin erken aşamalarında farklı bir akış vardı</w:t>
+      </w:r>
+      <w:r>
+        <w:t>.</w:t>
+      </w:r>
+      <w:r>
         <w:t xml:space="preserve"> </w:t>
       </w:r>
       <w:r>
-        <w:t xml:space="preserve">test edilecek parametreleri tanımlarken </w:t>
+        <w:t>H</w:t>
+      </w:r>
+      <w:r>
+        <w:t>em gerçekçilik hem de simülasyonların hızlanması için belirli optimizasyonlar yapıldı.</w:t>
+      </w:r>
+    </w:p>
+    <w:p>
+      <w:r>
+        <w:t xml:space="preserve">En önemli değişiklik, cross-correlation fonksiyonu üzerinden spektruma geçmek yerine </w:t>
       </w:r>
       <w:proofErr w:type="spellStart"/>
       <w:r>
-        <w:rPr>
-          <w:rFonts w:ascii="Cascadia Mono SemiLight" w:hAnsi="Cascadia Mono SemiLight"/>
-          <w:highlight w:val="lightGray"/>
-        </w:rPr>
-        <w:t>run_comparisons_main.m</w:t>
-      </w:r>
-      <w:proofErr w:type="spellEnd"/>
-      <w:r>
-        <w:t xml:space="preserve"> her değeri bağımsız olarak çalıştırmakta ve sonuçları kaydetmektedir. Ana hesaplamalar </w:t>
-      </w:r>
-      <w:proofErr w:type="spellStart"/>
-      <w:r>
-        <w:rPr>
-          <w:rFonts w:ascii="Cascadia Mono SemiLight" w:hAnsi="Cascadia Mono SemiLight"/>
-          <w:highlight w:val="lightGray"/>
-        </w:rPr>
-        <w:t>run_simulation.m</w:t>
-      </w:r>
-      <w:proofErr w:type="spellEnd"/>
-      <w:r>
-        <w:t xml:space="preserve"> içinde gerçekleştirilmektedir.</w:t>
-      </w:r>
-    </w:p>
-    <w:p>
-      <w:r>
-        <w:t xml:space="preserve">Güncel kodda her iterasyonda yeni bir DUT, Ref1 ve Ref2 realizasyonu oluşturulmaktadır. Aynı </w:t>
-      </w:r>
-      <w:proofErr w:type="spellStart"/>
-      <w:r>
-        <w:t>iterasyondaki</w:t>
-      </w:r>
-      <w:proofErr w:type="spellEnd"/>
-      <w:r>
-        <w:t xml:space="preserve"> iki kanal ortak DUT realizasyonunu kullanırken referans realizasyonları birbirinden bağımsızdır.</w:t>
-      </w:r>
-    </w:p>
-    <w:p>
-      <w:pPr>
-        <w:pStyle w:val="Heading2"/>
-      </w:pPr>
-      <w:r>
-        <w:t>6.2. Yapılan optimizasyonlar</w:t>
-      </w:r>
-    </w:p>
-    <w:p>
-      <w:r>
-        <w:t xml:space="preserve">Daha önce 5.2’de bahsedildiği gibi projenin erken aşamalarında farklı bir akış </w:t>
-      </w:r>
-      <w:proofErr w:type="gramStart"/>
-      <w:r>
-        <w:t>vardı,</w:t>
-      </w:r>
-      <w:proofErr w:type="gramEnd"/>
-      <w:r>
-        <w:t xml:space="preserve"> hem gerçekçilik hem de simülasyonların hızlanması için belirli optimizasyonlar yapıldı.</w:t>
-      </w:r>
-    </w:p>
-    <w:p>
-      <w:r>
-        <w:t>En önemli değişiklik, cross-correlation fonksiyonu üzerinden spektruma geçmek yerine cross-</w:t>
-      </w:r>
-      <w:proofErr w:type="spellStart"/>
-      <w:r>
-        <w:t>spectrum’un</w:t>
+        <w:t>cross-spectrum’un</w:t>
       </w:r>
       <w:proofErr w:type="spellEnd"/>
       <w:r>
@@ -6456,10 +7417,356 @@
         <w:t>Bu yöntem matematiksel olarak önceki yaklaşımla eşdeğerdir; ancak büyük örnek ve iterasyon sayılarında daha hızlı çalışır.</w:t>
       </w:r>
     </w:p>
+    <w:p>
+      <w:pPr>
+        <w:rPr>
+          <w:rFonts w:eastAsiaTheme="minorEastAsia" w:cs="Arial"/>
+        </w:rPr>
+      </w:pPr>
+      <w:r>
+        <w:t xml:space="preserve">İkinci önemli düzeltme ise küçük sinyal yaklaşımından vazgeçmek oldu. Küçük sinyal yaklaşımı yüksek RMS değerlerinde sonucu belirli düzeyde yanıltmakta ve ayrıca </w:t>
+      </w:r>
+      <w:proofErr w:type="spellStart"/>
+      <w:r>
+        <w:t>correction</w:t>
+      </w:r>
+      <w:proofErr w:type="spellEnd"/>
+      <w:r>
+        <w:t xml:space="preserve"> </w:t>
+      </w:r>
+      <w:proofErr w:type="spellStart"/>
+      <w:r>
+        <w:t>factor</w:t>
+      </w:r>
+      <w:proofErr w:type="spellEnd"/>
+      <w:r>
+        <w:t xml:space="preserve"> hesabı gerektiriyordu. Bunun yerine LPF çıkışının faz detektörü kazancına bölümü doğrudan </w:t>
+      </w:r>
+      <w:proofErr w:type="gramStart"/>
+      <w:r>
+        <w:rPr>
+          <w:rFonts w:ascii="Cascadia Mono SemiLight" w:hAnsi="Cascadia Mono SemiLight"/>
+          <w:sz w:val="20"/>
+        </w:rPr>
+        <w:t>asin(</w:t>
+      </w:r>
+      <w:proofErr w:type="gramEnd"/>
+      <w:r>
+        <w:rPr>
+          <w:rFonts w:ascii="Cascadia Mono SemiLight" w:hAnsi="Cascadia Mono SemiLight"/>
+          <w:sz w:val="20"/>
+        </w:rPr>
+        <w:t>)</w:t>
+      </w:r>
+      <w:r>
+        <w:rPr>
+          <w:rFonts w:ascii="Cascadia Mono SemiLight" w:hAnsi="Cascadia Mono SemiLight"/>
+          <w:sz w:val="20"/>
+        </w:rPr>
+        <w:t xml:space="preserve"> </w:t>
+      </w:r>
+      <w:r>
+        <w:rPr>
+          <w:rFonts w:cs="Arial"/>
+        </w:rPr>
+        <w:t xml:space="preserve">fonksiyonu ile </w:t>
+      </w:r>
+      <m:oMath>
+        <m:r>
+          <w:rPr>
+            <w:rFonts w:ascii="Cambria Math" w:hAnsi="Cambria Math" w:cs="Arial"/>
+            <w:sz w:val="24"/>
+          </w:rPr>
+          <m:t>∆∅</m:t>
+        </m:r>
+      </m:oMath>
+      <w:r>
+        <w:rPr>
+          <w:rFonts w:eastAsiaTheme="minorEastAsia" w:cs="Arial"/>
+        </w:rPr>
+        <w:t>’ye çevrildi.</w:t>
+      </w:r>
+    </w:p>
+    <w:p>
+      <w:pPr>
+        <w:jc w:val="center"/>
+        <w:rPr>
+          <w:rFonts w:cs="Arial"/>
+        </w:rPr>
+      </w:pPr>
+      <w:r>
+        <w:rPr>
+          <w:noProof/>
+        </w:rPr>
+        <w:lastRenderedPageBreak/>
+        <w:drawing>
+          <wp:inline distT="0" distB="0" distL="0" distR="0">
+            <wp:extent cx="5742432" cy="3065808"/>
+            <wp:effectExtent l="0" t="0" r="0" b="1270"/>
+            <wp:docPr id="10" name="Picture 10"/>
+            <wp:cNvGraphicFramePr>
+              <a:graphicFrameLocks xmlns:a="http://schemas.openxmlformats.org/drawingml/2006/main" noChangeAspect="1"/>
+            </wp:cNvGraphicFramePr>
+            <a:graphic xmlns:a="http://schemas.openxmlformats.org/drawingml/2006/main">
+              <a:graphicData uri="http://schemas.openxmlformats.org/drawingml/2006/picture">
+                <pic:pic xmlns:pic="http://schemas.openxmlformats.org/drawingml/2006/picture">
+                  <pic:nvPicPr>
+                    <pic:cNvPr id="0" name="Picture 1"/>
+                    <pic:cNvPicPr>
+                      <a:picLocks noChangeAspect="1" noChangeArrowheads="1"/>
+                    </pic:cNvPicPr>
+                  </pic:nvPicPr>
+                  <pic:blipFill rotWithShape="1">
+                    <a:blip r:embed="rId22" cstate="print">
+                      <a:extLst>
+                        <a:ext uri="{28A0092B-C50C-407E-A947-70E740481C1C}">
+                          <a14:useLocalDpi xmlns:a14="http://schemas.microsoft.com/office/drawing/2010/main" val="0"/>
+                        </a:ext>
+                      </a:extLst>
+                    </a:blip>
+                    <a:srcRect l="8860" t="3756" r="6422" b="4244"/>
+                    <a:stretch/>
+                  </pic:blipFill>
+                  <pic:spPr bwMode="auto">
+                    <a:xfrm>
+                      <a:off x="0" y="0"/>
+                      <a:ext cx="5787435" cy="3089835"/>
+                    </a:xfrm>
+                    <a:prstGeom prst="rect">
+                      <a:avLst/>
+                    </a:prstGeom>
+                    <a:noFill/>
+                    <a:ln>
+                      <a:noFill/>
+                    </a:ln>
+                    <a:extLst>
+                      <a:ext uri="{53640926-AAD7-44D8-BBD7-CCE9431645EC}">
+                        <a14:shadowObscured xmlns:a14="http://schemas.microsoft.com/office/drawing/2010/main"/>
+                      </a:ext>
+                    </a:extLst>
+                  </pic:spPr>
+                </pic:pic>
+              </a:graphicData>
+            </a:graphic>
+          </wp:inline>
+        </w:drawing>
+      </w:r>
+    </w:p>
+    <w:p>
+      <w:pPr>
+        <w:jc w:val="center"/>
+        <w:rPr>
+          <w:i/>
+          <w:sz w:val="18"/>
+        </w:rPr>
+      </w:pPr>
+      <w:r>
+        <w:rPr>
+          <w:i/>
+          <w:sz w:val="18"/>
+        </w:rPr>
+        <w:t xml:space="preserve">Şekil </w:t>
+      </w:r>
+      <w:r>
+        <w:rPr>
+          <w:i/>
+          <w:sz w:val="18"/>
+        </w:rPr>
+        <w:t>7</w:t>
+      </w:r>
+      <w:r>
+        <w:rPr>
+          <w:i/>
+          <w:sz w:val="18"/>
+        </w:rPr>
+        <w:t>.</w:t>
+      </w:r>
+      <w:r>
+        <w:rPr>
+          <w:i/>
+          <w:sz w:val="18"/>
+        </w:rPr>
+        <w:t>2</w:t>
+      </w:r>
+      <w:r>
+        <w:rPr>
+          <w:i/>
+          <w:sz w:val="18"/>
+        </w:rPr>
+        <w:t xml:space="preserve"> – </w:t>
+      </w:r>
+      <w:r>
+        <w:rPr>
+          <w:i/>
+          <w:sz w:val="18"/>
+        </w:rPr>
+        <w:t>Küçük-açı yaklaşımı asin faz geri dönüşümünün, üç bağımsız 200 iterasyonlu koşuda orijinal DUT spektrumuna göre karşılaştırılması.</w:t>
+      </w:r>
+    </w:p>
+    <w:p>
+      <w:pPr>
+        <w:jc w:val="center"/>
+        <w:rPr>
+          <w:i/>
+          <w:sz w:val="18"/>
+        </w:rPr>
+      </w:pPr>
+    </w:p>
+    <w:p>
+      <w:r>
+        <w:t xml:space="preserve">Şekil 6.2’deki 200 iterasyonlu karşılaştırmada, düşük gürültü seviyesinde (DUT 0.02, referanslar 0.05 </w:t>
+      </w:r>
+      <w:proofErr w:type="spellStart"/>
+      <w:r>
+        <w:t>rad</w:t>
+      </w:r>
+      <w:proofErr w:type="spellEnd"/>
+      <w:r>
+        <w:t xml:space="preserve">) </w:t>
+      </w:r>
+      <w:proofErr w:type="gramStart"/>
+      <w:r>
+        <w:rPr>
+          <w:rFonts w:ascii="Cascadia Mono SemiLight" w:hAnsi="Cascadia Mono SemiLight"/>
+          <w:sz w:val="20"/>
+          <w:szCs w:val="20"/>
+        </w:rPr>
+        <w:t>asin(</w:t>
+      </w:r>
+      <w:proofErr w:type="gramEnd"/>
+      <w:r>
+        <w:rPr>
+          <w:rFonts w:ascii="Cascadia Mono SemiLight" w:hAnsi="Cascadia Mono SemiLight"/>
+          <w:sz w:val="20"/>
+          <w:szCs w:val="20"/>
+        </w:rPr>
+        <w:t>)</w:t>
+      </w:r>
+      <w:r>
+        <w:t xml:space="preserve"> kullanımı MAE değerini 0,01 </w:t>
+      </w:r>
+      <w:proofErr w:type="spellStart"/>
+      <w:r>
+        <w:t>dB’den</w:t>
+      </w:r>
+      <w:proofErr w:type="spellEnd"/>
+      <w:r>
+        <w:t xml:space="preserve"> daha az değiştirmiş ve küçük açı yaklaşımının bu bölgede geçerli olduğunu göstermiştir. Buna karşılık DUT 0.2 </w:t>
+      </w:r>
+      <w:proofErr w:type="spellStart"/>
+      <w:r>
+        <w:t>rad</w:t>
+      </w:r>
+      <w:proofErr w:type="spellEnd"/>
+      <w:r>
+        <w:t xml:space="preserve"> ve referanslar 0.5 </w:t>
+      </w:r>
+      <w:proofErr w:type="spellStart"/>
+      <w:r>
+        <w:t>rad</w:t>
+      </w:r>
+      <w:proofErr w:type="spellEnd"/>
+      <w:r>
+        <w:t xml:space="preserve"> olduğunda </w:t>
+      </w:r>
+      <w:proofErr w:type="gramStart"/>
+      <w:r>
+        <w:rPr>
+          <w:rFonts w:ascii="Cascadia Mono SemiLight" w:hAnsi="Cascadia Mono SemiLight"/>
+          <w:sz w:val="20"/>
+          <w:szCs w:val="20"/>
+        </w:rPr>
+        <w:t>asin(</w:t>
+      </w:r>
+      <w:proofErr w:type="gramEnd"/>
+      <w:r>
+        <w:rPr>
+          <w:rFonts w:ascii="Cascadia Mono SemiLight" w:hAnsi="Cascadia Mono SemiLight"/>
+          <w:sz w:val="20"/>
+          <w:szCs w:val="20"/>
+        </w:rPr>
+        <w:t>)</w:t>
+      </w:r>
+      <w:r>
+        <w:rPr>
+          <w:rFonts w:ascii="Cascadia Mono SemiLight" w:hAnsi="Cascadia Mono SemiLight"/>
+          <w:sz w:val="20"/>
+          <w:szCs w:val="20"/>
+        </w:rPr>
+        <w:t xml:space="preserve"> </w:t>
+      </w:r>
+      <w:r>
+        <w:t xml:space="preserve">üç bağımsız koşuda </w:t>
+      </w:r>
+      <w:proofErr w:type="spellStart"/>
+      <w:r>
+        <w:t>MAE’yi</w:t>
+      </w:r>
+      <w:proofErr w:type="spellEnd"/>
+      <w:r>
+        <w:t xml:space="preserve"> 0.53 – 1.16 dB azaltmış, ortalama MAE 2.04 </w:t>
+      </w:r>
+      <w:proofErr w:type="spellStart"/>
+      <w:r>
+        <w:t>dB’den</w:t>
+      </w:r>
+      <w:proofErr w:type="spellEnd"/>
+      <w:r>
+        <w:t xml:space="preserve"> 1.25 </w:t>
+      </w:r>
+      <w:proofErr w:type="spellStart"/>
+      <w:r>
+        <w:t>dB’ye</w:t>
+      </w:r>
+      <w:proofErr w:type="spellEnd"/>
+      <w:r>
+        <w:t xml:space="preserve"> düşerek yaklaşık 0.79 dB iyileştirmiştir.</w:t>
+      </w:r>
+    </w:p>
+    <w:p>
+      <w:r>
+        <w:t xml:space="preserve">Bu sonuç, yüksek faz sapmalarında sinüzoidal faz detektörü çıkışında çıkışındaki sıkışmanın ihmal edilemeyeceğini göstermiş, bu nedenle optimize edilmiş yöntemde LPF ve </w:t>
+      </w:r>
+      <w:proofErr w:type="spellStart"/>
+      <w:r>
+        <w:t>K</w:t>
+      </w:r>
+      <w:r>
+        <w:rPr>
+          <w:vertAlign w:val="subscript"/>
+        </w:rPr>
+        <w:t>pd</w:t>
+      </w:r>
+      <w:proofErr w:type="spellEnd"/>
+      <w:r>
+        <w:t xml:space="preserve"> normalizasyonundan sonra </w:t>
+      </w:r>
+      <w:proofErr w:type="gramStart"/>
+      <w:r>
+        <w:rPr>
+          <w:rFonts w:ascii="Cascadia Mono SemiLight" w:hAnsi="Cascadia Mono SemiLight"/>
+          <w:sz w:val="20"/>
+          <w:szCs w:val="20"/>
+        </w:rPr>
+        <w:t>asin(</w:t>
+      </w:r>
+      <w:proofErr w:type="gramEnd"/>
+      <w:r>
+        <w:rPr>
+          <w:rFonts w:ascii="Cascadia Mono SemiLight" w:hAnsi="Cascadia Mono SemiLight"/>
+          <w:sz w:val="20"/>
+          <w:szCs w:val="20"/>
+        </w:rPr>
+        <w:t>)</w:t>
+      </w:r>
+      <w:r>
+        <w:t xml:space="preserve"> ile doğrusal olmayan faz geri dönüşümü uygulanmıştır.</w:t>
+      </w:r>
+    </w:p>
     <w:tbl>
       <w:tblPr>
         <w:tblStyle w:val="GridTable4-Accent3"/>
-        <w:tblpPr w:leftFromText="141" w:rightFromText="141" w:vertAnchor="page" w:horzAnchor="margin" w:tblpXSpec="center" w:tblpY="522"/>
+        <w:tblpPr w:leftFromText="141" w:rightFromText="141" w:vertAnchor="page" w:horzAnchor="margin" w:tblpXSpec="center" w:tblpY="10231"/>
         <w:tblW w:w="10199" w:type="dxa"/>
         <w:tblLook w:val="04A0" w:firstRow="1" w:lastRow="0" w:firstColumn="1" w:lastColumn="0" w:noHBand="0" w:noVBand="1"/>
       </w:tblPr>
@@ -6496,7 +7803,6 @@
                 <w:color w:val="auto"/>
                 <w:sz w:val="20"/>
               </w:rPr>
-              <w:lastRenderedPageBreak/>
               <w:t>Önceki Yöntem</w:t>
             </w:r>
           </w:p>
@@ -6581,21 +7887,23 @@
               </w:rPr>
             </w:pPr>
             <w:proofErr w:type="spellStart"/>
+            <w:proofErr w:type="gramStart"/>
             <w:r>
               <w:rPr>
                 <w:rFonts w:ascii="Cascadia Mono SemiLight" w:hAnsi="Cascadia Mono SemiLight"/>
                 <w:b w:val="0"/>
-                <w:sz w:val="18"/>
+                <w:sz w:val="20"/>
                 <w:szCs w:val="20"/>
               </w:rPr>
               <w:t>xcorr</w:t>
             </w:r>
             <w:proofErr w:type="spellEnd"/>
+            <w:proofErr w:type="gramEnd"/>
             <w:r>
               <w:rPr>
                 <w:rFonts w:ascii="Cascadia Mono SemiLight" w:hAnsi="Cascadia Mono SemiLight"/>
                 <w:b w:val="0"/>
-                <w:sz w:val="18"/>
+                <w:sz w:val="20"/>
                 <w:szCs w:val="20"/>
               </w:rPr>
               <w:t xml:space="preserve"> → </w:t>
@@ -6605,7 +7913,7 @@
               <w:rPr>
                 <w:rFonts w:ascii="Cascadia Mono SemiLight" w:hAnsi="Cascadia Mono SemiLight"/>
                 <w:b w:val="0"/>
-                <w:sz w:val="18"/>
+                <w:sz w:val="20"/>
                 <w:szCs w:val="20"/>
               </w:rPr>
               <w:t>ifftshift</w:t>
@@ -6615,7 +7923,7 @@
               <w:rPr>
                 <w:rFonts w:ascii="Cascadia Mono SemiLight" w:hAnsi="Cascadia Mono SemiLight"/>
                 <w:b w:val="0"/>
-                <w:sz w:val="18"/>
+                <w:sz w:val="20"/>
                 <w:szCs w:val="20"/>
               </w:rPr>
               <w:t xml:space="preserve"> → </w:t>
@@ -6625,7 +7933,7 @@
               <w:rPr>
                 <w:rFonts w:ascii="Cascadia Mono SemiLight" w:hAnsi="Cascadia Mono SemiLight"/>
                 <w:b w:val="0"/>
-                <w:sz w:val="18"/>
+                <w:sz w:val="20"/>
                 <w:szCs w:val="20"/>
               </w:rPr>
               <w:t>fft</w:t>
@@ -6664,7 +7972,6 @@
                     <w:rPr>
                       <w:rFonts w:ascii="Cambria Math" w:hAnsi="Cambria Math"/>
                       <w:i/>
-                      <w:sz w:val="20"/>
                       <w:szCs w:val="20"/>
                     </w:rPr>
                   </m:ctrlPr>
@@ -6673,7 +7980,6 @@
                   <m:r>
                     <w:rPr>
                       <w:rFonts w:ascii="Cambria Math" w:hAnsi="Cambria Math"/>
-                      <w:sz w:val="20"/>
                       <w:szCs w:val="20"/>
                     </w:rPr>
                     <m:t>X</m:t>
@@ -6683,7 +7989,6 @@
                   <m:r>
                     <w:rPr>
                       <w:rFonts w:ascii="Cambria Math" w:hAnsi="Cambria Math"/>
-                      <w:sz w:val="20"/>
                       <w:szCs w:val="20"/>
                     </w:rPr>
                     <m:t>1</m:t>
@@ -6696,7 +8001,6 @@
                     <w:rPr>
                       <w:rFonts w:ascii="Cambria Math" w:hAnsi="Cambria Math"/>
                       <w:i/>
-                      <w:sz w:val="20"/>
                       <w:szCs w:val="20"/>
                     </w:rPr>
                   </m:ctrlPr>
@@ -6705,7 +8009,6 @@
                   <m:r>
                     <w:rPr>
                       <w:rFonts w:ascii="Cambria Math" w:hAnsi="Cambria Math"/>
-                      <w:sz w:val="20"/>
                       <w:szCs w:val="20"/>
                     </w:rPr>
                     <m:t>X</m:t>
@@ -6715,7 +8018,6 @@
                   <m:r>
                     <w:rPr>
                       <w:rFonts w:ascii="Cambria Math" w:hAnsi="Cambria Math"/>
-                      <w:sz w:val="20"/>
                       <w:szCs w:val="20"/>
                     </w:rPr>
                     <m:t>2</m:t>
@@ -6725,7 +8027,6 @@
                   <m:r>
                     <w:rPr>
                       <w:rFonts w:ascii="Cambria Math" w:hAnsi="Cambria Math"/>
-                      <w:sz w:val="20"/>
                       <w:szCs w:val="20"/>
                     </w:rPr>
                     <m:t>*</m:t>
@@ -6782,7 +8083,6 @@
                         <w:rFonts w:ascii="Cambria Math" w:hAnsi="Cambria Math"/>
                         <w:b w:val="0"/>
                         <w:i/>
-                        <w:sz w:val="20"/>
                         <w:szCs w:val="20"/>
                       </w:rPr>
                     </m:ctrlPr>
@@ -6794,7 +8094,6 @@
                       </m:rPr>
                       <w:rPr>
                         <w:rFonts w:ascii="Cambria Math" w:hAnsi="Cambria Math"/>
-                        <w:sz w:val="20"/>
                         <w:szCs w:val="20"/>
                       </w:rPr>
                       <m:t>N</m:t>
@@ -6807,7 +8106,6 @@
                       </m:rPr>
                       <w:rPr>
                         <w:rFonts w:ascii="Cambria Math" w:hAnsi="Cambria Math"/>
-                        <w:sz w:val="20"/>
                         <w:szCs w:val="20"/>
                       </w:rPr>
                       <m:t>FFT</m:t>
@@ -6820,7 +8118,6 @@
                   </m:rPr>
                   <w:rPr>
                     <w:rFonts w:ascii="Cambria Math" w:hAnsi="Cambria Math"/>
-                    <w:sz w:val="20"/>
                     <w:szCs w:val="20"/>
                   </w:rPr>
                   <m:t>=2</m:t>
@@ -6832,7 +8129,6 @@
                         <w:rFonts w:ascii="Cambria Math" w:hAnsi="Cambria Math"/>
                         <w:b w:val="0"/>
                         <w:i/>
-                        <w:sz w:val="20"/>
                         <w:szCs w:val="20"/>
                       </w:rPr>
                     </m:ctrlPr>
@@ -6844,7 +8140,6 @@
                       </m:rPr>
                       <w:rPr>
                         <w:rFonts w:ascii="Cambria Math" w:hAnsi="Cambria Math"/>
-                        <w:sz w:val="20"/>
                         <w:szCs w:val="20"/>
                       </w:rPr>
                       <m:t>N</m:t>
@@ -6857,7 +8152,6 @@
                       </m:rPr>
                       <w:rPr>
                         <w:rFonts w:ascii="Cambria Math" w:hAnsi="Cambria Math"/>
-                        <w:sz w:val="20"/>
                         <w:szCs w:val="20"/>
                       </w:rPr>
                       <m:t>C</m:t>
@@ -6870,7 +8164,6 @@
                   </m:rPr>
                   <w:rPr>
                     <w:rFonts w:ascii="Cambria Math" w:hAnsi="Cambria Math"/>
-                    <w:sz w:val="20"/>
                     <w:szCs w:val="20"/>
                   </w:rPr>
                   <m:t>-</m:t>
@@ -6881,7 +8174,6 @@
                   </m:rPr>
                   <w:rPr>
                     <w:rFonts w:ascii="Cambria Math" w:eastAsiaTheme="minorEastAsia" w:hAnsi="Cambria Math"/>
-                    <w:sz w:val="20"/>
                     <w:szCs w:val="20"/>
                   </w:rPr>
                   <m:t>1</m:t>
@@ -6905,6 +8197,7 @@
               </w:rPr>
             </w:pPr>
             <w:proofErr w:type="spellStart"/>
+            <w:proofErr w:type="gramStart"/>
             <w:r>
               <w:rPr>
                 <w:rFonts w:ascii="Cascadia Mono SemiLight" w:hAnsi="Cascadia Mono SemiLight"/>
@@ -6913,43 +8206,15 @@
               <w:t>nfft</w:t>
             </w:r>
             <w:proofErr w:type="spellEnd"/>
+            <w:proofErr w:type="gramEnd"/>
             <w:r>
               <w:rPr>
                 <w:rFonts w:ascii="Cascadia Mono SemiLight" w:hAnsi="Cascadia Mono SemiLight"/>
                 <w:sz w:val="20"/>
               </w:rPr>
-              <w:t>=</w:t>
-            </w:r>
-            <w:r>
-              <w:rPr>
-                <w:rFonts w:ascii="Cascadia Mono SemiLight" w:hAnsi="Cascadia Mono SemiLight"/>
-                <w:sz w:val="20"/>
-              </w:rPr>
-              <w:t>nextpow2(2</w:t>
-            </w:r>
-            <w:r>
-              <w:rPr>
-                <w:rFonts w:ascii="Cascadia Mono SemiLight" w:hAnsi="Cascadia Mono SemiLight"/>
-                <w:sz w:val="20"/>
-              </w:rPr>
-              <w:t xml:space="preserve"> </w:t>
-            </w:r>
-            <w:r>
-              <w:rPr>
-                <w:rFonts w:ascii="Cascadia Mono SemiLight" w:hAnsi="Cascadia Mono SemiLight"/>
-                <w:sz w:val="20"/>
-              </w:rPr>
-              <w:t>*</w:t>
-            </w:r>
-            <w:r>
-              <w:rPr>
-                <w:rFonts w:ascii="Cascadia Mono SemiLight" w:hAnsi="Cascadia Mono SemiLight"/>
-                <w:sz w:val="20"/>
-              </w:rPr>
-              <w:t xml:space="preserve"> </w:t>
+              <w:t xml:space="preserve">=nextpow2(2 * </w:t>
             </w:r>
             <w:proofErr w:type="spellStart"/>
-            <w:proofErr w:type="gramStart"/>
             <w:r>
               <w:rPr>
                 <w:rFonts w:ascii="Cascadia Mono SemiLight" w:hAnsi="Cascadia Mono SemiLight"/>
@@ -6963,15 +8228,7 @@
                 <w:rFonts w:ascii="Cascadia Mono SemiLight" w:hAnsi="Cascadia Mono SemiLight"/>
                 <w:sz w:val="20"/>
               </w:rPr>
-              <w:t xml:space="preserve"> -</w:t>
-            </w:r>
-            <w:proofErr w:type="gramEnd"/>
-            <w:r>
-              <w:rPr>
-                <w:rFonts w:ascii="Cascadia Mono SemiLight" w:hAnsi="Cascadia Mono SemiLight"/>
-                <w:sz w:val="20"/>
-              </w:rPr>
-              <w:t xml:space="preserve"> 1)</w:t>
+              <w:t xml:space="preserve"> - 1)</w:t>
             </w:r>
           </w:p>
         </w:tc>
@@ -7027,7 +8284,25 @@
                 <w:sz w:val="20"/>
                 <w:szCs w:val="20"/>
               </w:rPr>
-              <w:t xml:space="preserve"> her iterasyonda tasarlanması</w:t>
+              <w:t xml:space="preserve"> her </w:t>
+            </w:r>
+            <w:proofErr w:type="spellStart"/>
+            <w:r>
+              <w:rPr>
+                <w:b w:val="0"/>
+                <w:sz w:val="20"/>
+                <w:szCs w:val="20"/>
+              </w:rPr>
+              <w:t>iterasyonda</w:t>
+            </w:r>
+            <w:proofErr w:type="spellEnd"/>
+            <w:r>
+              <w:rPr>
+                <w:b w:val="0"/>
+                <w:sz w:val="20"/>
+                <w:szCs w:val="20"/>
+              </w:rPr>
+              <w:t xml:space="preserve"> tasarlanması</w:t>
             </w:r>
           </w:p>
         </w:tc>
@@ -7166,7 +8441,25 @@
                 <w:sz w:val="20"/>
                 <w:szCs w:val="20"/>
               </w:rPr>
-              <w:t>Her iterasyonda kayan ortalama</w:t>
+              <w:t xml:space="preserve">Her </w:t>
+            </w:r>
+            <w:proofErr w:type="spellStart"/>
+            <w:r>
+              <w:rPr>
+                <w:b w:val="0"/>
+                <w:sz w:val="20"/>
+                <w:szCs w:val="20"/>
+              </w:rPr>
+              <w:t>iterasyonda</w:t>
+            </w:r>
+            <w:proofErr w:type="spellEnd"/>
+            <w:r>
+              <w:rPr>
+                <w:b w:val="0"/>
+                <w:sz w:val="20"/>
+                <w:szCs w:val="20"/>
+              </w:rPr>
+              <w:t xml:space="preserve"> kayan ortalama</w:t>
             </w:r>
           </w:p>
         </w:tc>
@@ -7228,23 +8521,13 @@
                 <w:szCs w:val="20"/>
               </w:rPr>
             </w:pPr>
-            <w:proofErr w:type="spellStart"/>
             <w:r>
               <w:rPr>
                 <w:b w:val="0"/>
                 <w:sz w:val="20"/>
                 <w:szCs w:val="20"/>
               </w:rPr>
-              <w:t>Log</w:t>
-            </w:r>
-            <w:proofErr w:type="spellEnd"/>
-            <w:r>
-              <w:rPr>
-                <w:b w:val="0"/>
-                <w:sz w:val="20"/>
-                <w:szCs w:val="20"/>
-              </w:rPr>
-              <w:t>-bin içinde maksimum değer</w:t>
+              <w:t>Log-bin içinde maksimum değer</w:t>
             </w:r>
           </w:p>
         </w:tc>
@@ -7418,13 +8701,23 @@
               </w:rPr>
             </w:pPr>
             <w:proofErr w:type="spellStart"/>
+            <w:proofErr w:type="gramStart"/>
             <w:r>
               <w:rPr>
                 <w:rFonts w:ascii="Cascadia Mono SemiLight" w:hAnsi="Cascadia Mono SemiLight"/>
                 <w:sz w:val="18"/>
                 <w:szCs w:val="20"/>
               </w:rPr>
-              <w:t>validate_config</w:t>
+              <w:t>validate</w:t>
+            </w:r>
+            <w:proofErr w:type="gramEnd"/>
+            <w:r>
+              <w:rPr>
+                <w:rFonts w:ascii="Cascadia Mono SemiLight" w:hAnsi="Cascadia Mono SemiLight"/>
+                <w:sz w:val="18"/>
+                <w:szCs w:val="20"/>
+              </w:rPr>
+              <w:t>_config</w:t>
             </w:r>
             <w:proofErr w:type="spellEnd"/>
             <w:r>
@@ -7476,6 +8769,7 @@
         <w:rPr>
           <w:b/>
         </w:rPr>
+        <w:lastRenderedPageBreak/>
         <w:t>Parametrik Karşılaştırmalar</w:t>
       </w:r>
     </w:p>
@@ -7484,11 +8778,13 @@
         <w:pStyle w:val="Heading2"/>
       </w:pPr>
       <w:r>
-        <w:t>7.1. Temel simülasyon parametreleri</w:t>
-      </w:r>
-    </w:p>
-    <w:p>
-      <w:proofErr w:type="spellStart"/>
+        <w:t>8</w:t>
+      </w:r>
+      <w:r>
+        <w:t>.1. Temel simülasyon parametreleri</w:t>
+      </w:r>
+    </w:p>
+    <w:p>
       <w:r>
         <w:rPr>
           <w:rFonts w:ascii="Cascadia Mono SemiLight" w:hAnsi="Cascadia Mono SemiLight"/>
@@ -7497,7 +8793,6 @@
         </w:rPr>
         <w:t>run_comparisons.m</w:t>
       </w:r>
-      <w:proofErr w:type="spellEnd"/>
       <w:r>
         <w:rPr>
           <w:rFonts w:ascii="Cascadia Mono SemiLight" w:hAnsi="Cascadia Mono SemiLight"/>
@@ -7790,7 +9085,10 @@
               <w:cnfStyle w:val="000000000000" w:firstRow="0" w:lastRow="0" w:firstColumn="0" w:lastColumn="0" w:oddVBand="0" w:evenVBand="0" w:oddHBand="0" w:evenHBand="0" w:firstRowFirstColumn="0" w:firstRowLastColumn="0" w:lastRowFirstColumn="0" w:lastRowLastColumn="0"/>
             </w:pPr>
             <w:r>
-              <w:t>200 kHz</w:t>
+              <w:t>5</w:t>
+            </w:r>
+            <w:r>
+              <w:t>0 kHz</w:t>
             </w:r>
           </w:p>
         </w:tc>
@@ -7854,21 +9152,7 @@
               <w:rPr>
                 <w:b w:val="0"/>
               </w:rPr>
-              <w:t xml:space="preserve">Ref. 1 / </w:t>
-            </w:r>
-            <w:proofErr w:type="spellStart"/>
-            <w:r>
-              <w:rPr>
-                <w:b w:val="0"/>
-              </w:rPr>
-              <w:t>Ref</w:t>
-            </w:r>
-            <w:proofErr w:type="spellEnd"/>
-            <w:r>
-              <w:rPr>
-                <w:b w:val="0"/>
-              </w:rPr>
-              <w:t>. 2 RMS</w:t>
+              <w:t>Ref. 1 / Ref. 2 RMS</w:t>
             </w:r>
           </w:p>
         </w:tc>
@@ -7941,19 +9225,11 @@
                 <w:b w:val="0"/>
               </w:rPr>
             </w:pPr>
-            <w:proofErr w:type="spellStart"/>
             <w:r>
               <w:rPr>
                 <w:b w:val="0"/>
               </w:rPr>
-              <w:t>Log</w:t>
-            </w:r>
-            <w:proofErr w:type="spellEnd"/>
-            <w:r>
-              <w:rPr>
-                <w:b w:val="0"/>
-              </w:rPr>
-              <w:t>-bin sayısı</w:t>
+              <w:t>Log-bin sayısı</w:t>
             </w:r>
           </w:p>
         </w:tc>
@@ -7973,6 +9249,7 @@
         </w:tc>
       </w:tr>
     </w:tbl>
+    <w:p/>
     <w:p>
       <w:r>
         <w:t>Her deneyde yalnızca incelenen parametre değiştirilmiş, diğer parametreler temel değerlerinde tutulmuştur.</w:t>
@@ -7980,23 +9257,19 @@
     </w:p>
     <w:p>
       <w:r>
-        <w:t xml:space="preserve">Yalnızca farklı olarak uzun iterasyon karşılaştırmasında </w:t>
-      </w:r>
-      <w:proofErr w:type="spellStart"/>
-      <w:r>
-        <w:t>cutoff</w:t>
-      </w:r>
-      <w:proofErr w:type="spellEnd"/>
-      <w:r>
-        <w:t xml:space="preserve"> frekansı 100 MHz olarak belirlenmiş ve referans sinyallerinin RMS değeri </w:t>
-      </w:r>
-      <w:proofErr w:type="spellStart"/>
-      <w:r>
-        <w:t>iterasyonla</w:t>
-      </w:r>
-      <w:proofErr w:type="spellEnd"/>
-      <w:r>
-        <w:t xml:space="preserve"> birlikte sonucun yakınsaması için DUT’den daha yüksek seçilmiştir.</w:t>
+        <w:t>Yalnızca farklı olarak uzun iterasyon karşılaştırmasında cut</w:t>
+      </w:r>
+      <w:r>
+        <w:t>-</w:t>
+      </w:r>
+      <w:r>
+        <w:t>off frekansı 100 MHz olarak belirlenmiş ve referans sinyallerinin RMS değeri iterasyonla birlikte sonucun yakınsaması</w:t>
+      </w:r>
+      <w:r>
+        <w:t>nın daha net gözükmesi</w:t>
+      </w:r>
+      <w:r>
+        <w:t xml:space="preserve"> için DUT’den daha yüksek seçilmiştir.</w:t>
       </w:r>
     </w:p>
     <w:p/>
@@ -8005,13 +9278,24 @@
     <w:p/>
     <w:p/>
     <w:p/>
+    <w:p/>
+    <w:p/>
+    <w:p/>
+    <w:p/>
+    <w:p/>
+    <w:p/>
+    <w:p/>
+    <w:p/>
     <w:p>
       <w:pPr>
         <w:pStyle w:val="Heading2"/>
       </w:pPr>
       <w:r>
         <w:lastRenderedPageBreak/>
-        <w:t>7.2. LPF kesim frekansı karşılaştırması</w:t>
+        <w:t>8</w:t>
+      </w:r>
+      <w:r>
+        <w:t>.2. LPF kesim frekansı karşılaştırması</w:t>
       </w:r>
     </w:p>
     <w:p>
@@ -8130,25 +9414,10 @@
         </m:sSub>
       </m:oMath>
       <w:r>
-        <w:t xml:space="preserve"> bileşenini bastırırken ölçülebilecek faz gürültüsü </w:t>
-      </w:r>
-      <w:proofErr w:type="spellStart"/>
-      <w:r>
-        <w:t>offset</w:t>
-      </w:r>
-      <w:proofErr w:type="spellEnd"/>
-      <w:r>
-        <w:t xml:space="preserve"> bandını da belirler. Düşük kesim frekansı daha dar bir ölçüm bandı oluştururken yüksek kesim frekansı daha geniş </w:t>
-      </w:r>
-      <w:proofErr w:type="spellStart"/>
-      <w:r>
-        <w:t>offset</w:t>
-      </w:r>
-      <w:proofErr w:type="spellEnd"/>
-      <w:r>
-        <w:t xml:space="preserve"> aralığının geçirilmesini sağlar.</w:t>
-      </w:r>
-    </w:p>
+        <w:t xml:space="preserve"> bileşenini bastırırken ölçülebilecek faz gürültüsü offset bandını da belirler. Düşük kesim frekansı daha dar bir ölçüm bandı oluştururken yüksek kesim frekansı daha geniş offset aralığının geçirilmesini sağlar.</w:t>
+      </w:r>
+    </w:p>
+    <w:p/>
     <w:p>
       <w:pPr>
         <w:jc w:val="center"/>
@@ -8158,10 +9427,10 @@
           <w:noProof/>
         </w:rPr>
         <w:drawing>
-          <wp:inline distT="0" distB="0" distL="0" distR="0" wp14:anchorId="741FF55C" wp14:editId="0914B845">
-            <wp:extent cx="5760720" cy="4294195"/>
-            <wp:effectExtent l="0" t="0" r="0" b="0"/>
-            <wp:docPr id="6" name="Picture 6" descr="Şekil 7.1. Dokuz LPF kesim frekansında Cross-PSD ve aynı yinelemelerin filtresiz DUT periodogramı. N=1.000.000; temel DUT/Ref RMS=0,05 rad; 100 yineleme. Kaynak: Bu çalışma." title="Şekil 7"/>
+          <wp:inline distT="0" distB="0" distL="0" distR="0">
+            <wp:extent cx="5671966" cy="4144488"/>
+            <wp:effectExtent l="0" t="0" r="5080" b="8890"/>
+            <wp:docPr id="13" name="Picture 13"/>
             <wp:cNvGraphicFramePr>
               <a:graphicFrameLocks xmlns:a="http://schemas.openxmlformats.org/drawingml/2006/main" noChangeAspect="1"/>
             </wp:cNvGraphicFramePr>
@@ -8169,23 +9438,39 @@
               <a:graphicData uri="http://schemas.openxmlformats.org/drawingml/2006/picture">
                 <pic:pic xmlns:pic="http://schemas.openxmlformats.org/drawingml/2006/picture">
                   <pic:nvPicPr>
-                    <pic:cNvPr id="0" name="lpf_cutoff_comparison.png"/>
-                    <pic:cNvPicPr/>
+                    <pic:cNvPr id="0" name="Picture 3"/>
+                    <pic:cNvPicPr>
+                      <a:picLocks noChangeAspect="1" noChangeArrowheads="1"/>
+                    </pic:cNvPicPr>
                   </pic:nvPicPr>
-                  <pic:blipFill>
-                    <a:blip r:embed="rId15"/>
-                    <a:stretch>
-                      <a:fillRect/>
-                    </a:stretch>
+                  <pic:blipFill rotWithShape="1">
+                    <a:blip r:embed="rId23" cstate="print">
+                      <a:extLst>
+                        <a:ext uri="{28A0092B-C50C-407E-A947-70E740481C1C}">
+                          <a14:useLocalDpi xmlns:a14="http://schemas.microsoft.com/office/drawing/2010/main" val="0"/>
+                        </a:ext>
+                      </a:extLst>
+                    </a:blip>
+                    <a:srcRect l="8697" t="4785" r="6269" b="5481"/>
+                    <a:stretch/>
                   </pic:blipFill>
-                  <pic:spPr>
+                  <pic:spPr bwMode="auto">
                     <a:xfrm>
                       <a:off x="0" y="0"/>
-                      <a:ext cx="5760720" cy="4294195"/>
+                      <a:ext cx="5707128" cy="4170181"/>
                     </a:xfrm>
                     <a:prstGeom prst="rect">
                       <a:avLst/>
                     </a:prstGeom>
+                    <a:noFill/>
+                    <a:ln>
+                      <a:noFill/>
+                    </a:ln>
+                    <a:extLst>
+                      <a:ext uri="{53640926-AAD7-44D8-BBD7-CCE9431645EC}">
+                        <a14:shadowObscured xmlns:a14="http://schemas.microsoft.com/office/drawing/2010/main"/>
+                      </a:ext>
+                    </a:extLst>
                   </pic:spPr>
                 </pic:pic>
               </a:graphicData>
@@ -8214,7 +9499,7 @@
           <w:i/>
           <w:sz w:val="18"/>
         </w:rPr>
-        <w:t>7</w:t>
+        <w:t>8</w:t>
       </w:r>
       <w:r>
         <w:rPr>
@@ -8232,6 +9517,15 @@
       </w:r>
     </w:p>
     <w:p>
+      <w:pPr>
+        <w:jc w:val="center"/>
+        <w:rPr>
+          <w:i/>
+          <w:sz w:val="18"/>
+        </w:rPr>
+      </w:pPr>
+    </w:p>
+    <w:p>
       <w:r>
         <w:rPr>
           <w:i/>
@@ -8239,60 +9533,24 @@
         <w:t>Önemli nokta:</w:t>
       </w:r>
       <w:r>
-        <w:t xml:space="preserve"> Cross-PSD kanalları </w:t>
-      </w:r>
-      <w:proofErr w:type="spellStart"/>
-      <w:r>
-        <w:t>LPF’den</w:t>
-      </w:r>
-      <w:proofErr w:type="spellEnd"/>
-      <w:r>
-        <w:t xml:space="preserve"> geçerken karşılaştırılan DUT </w:t>
-      </w:r>
-      <w:proofErr w:type="spellStart"/>
-      <w:r>
-        <w:t>periodogramı</w:t>
-      </w:r>
-      <w:proofErr w:type="spellEnd"/>
-      <w:r>
-        <w:t xml:space="preserve"> filtresizdir. Bu nedenle kesim frekansının üzerinde eğrilerin ayrılması beklenen bir sonuçtur. MAE yorumlanırken esas olarak LPF geçiş bandı dikkate alınmalıdır.</w:t>
-      </w:r>
-    </w:p>
-    <w:p>
-      <w:r>
-        <w:t xml:space="preserve">Bu taramada en düşük gözlenen tam bant MAE 50 </w:t>
-      </w:r>
-      <w:proofErr w:type="spellStart"/>
-      <w:r>
-        <w:t>kHz'de</w:t>
-      </w:r>
-      <w:proofErr w:type="spellEnd"/>
-      <w:r>
-        <w:t xml:space="preserve"> 0,664 </w:t>
-      </w:r>
-      <w:proofErr w:type="spellStart"/>
-      <w:r>
-        <w:t>dB</w:t>
-      </w:r>
-      <w:proofErr w:type="spellEnd"/>
-      <w:r>
-        <w:t xml:space="preserve">, en yüksek değer 300 </w:t>
-      </w:r>
-      <w:proofErr w:type="spellStart"/>
-      <w:r>
-        <w:t>kHz'de</w:t>
-      </w:r>
-      <w:proofErr w:type="spellEnd"/>
-      <w:r>
-        <w:t xml:space="preserve"> 2,476 </w:t>
-      </w:r>
-      <w:proofErr w:type="spellStart"/>
-      <w:r>
-        <w:t>dB'dir</w:t>
-      </w:r>
-      <w:proofErr w:type="spellEnd"/>
-      <w:r>
-        <w:t>. Tek rastgele koşuya ve filtresiz DUT karşılaştırmasına dayandığı için en düşük nokta genel bir filtre optimumu olarak yorumlanmamıştır.</w:t>
+        <w:t xml:space="preserve"> Cross-PSD kanalları LPF’den geçerken karşılaştırılan DUT periodogramı filtresizdir. Bu nedenle kesim frekansının üzerinde eğrilerin ayrılması beklenen bir sonuçtur. MAE yorumlanırken esas olarak LPF geçiş bandı dikkate alınmalıdır.</w:t>
+      </w:r>
+    </w:p>
+    <w:p>
+      <w:r>
+        <w:t>Bu taramada en düşük gözlenen tam bant MAE 50 kHz'de 0,</w:t>
+      </w:r>
+      <w:r>
+        <w:t>805</w:t>
+      </w:r>
+      <w:r>
+        <w:t xml:space="preserve"> dB, en yüksek değer 300 kHz'de 2,4</w:t>
+      </w:r>
+      <w:r>
+        <w:t>58</w:t>
+      </w:r>
+      <w:r>
+        <w:t xml:space="preserve"> dB'dir. Tek rastgele koşuya ve filtresiz DUT karşılaştırmasına dayandığı için en düşük nokta genel bir filtre optimumu olarak yorumlanmamıştır.</w:t>
       </w:r>
     </w:p>
     <w:p>
@@ -8310,14 +9568,16 @@
       </w:r>
     </w:p>
     <w:p/>
-    <w:p/>
     <w:p>
       <w:pPr>
         <w:pStyle w:val="Heading2"/>
       </w:pPr>
       <w:r>
         <w:lastRenderedPageBreak/>
-        <w:t>7.3</w:t>
+        <w:t>8</w:t>
+      </w:r>
+      <w:r>
+        <w:t>.3</w:t>
       </w:r>
       <w:r>
         <w:t>. DUT sinyalinin farklı RMS değerlerinin karşılaştırılması</w:t>
@@ -8503,32 +9763,6 @@
       </w:r>
     </w:p>
     <w:p>
-      <w:r>
-        <w:t xml:space="preserve">Yüksek RMS değerlerinde faz detektörünün </w:t>
-      </w:r>
-      <m:oMath>
-        <m:r>
-          <w:rPr>
-            <w:rFonts w:ascii="Cambria Math" w:hAnsi="Cambria Math"/>
-          </w:rPr>
-          <m:t>sin(Δϕ)</m:t>
-        </m:r>
-      </m:oMath>
-      <w:r>
-        <w:t xml:space="preserve"> karakteristiği nedeniyle küçük açı yaklaşımından sapma artar. Kodda bulunan </w:t>
-      </w:r>
-      <w:r>
-        <w:rPr>
-          <w:rFonts w:ascii="Cascadia Mono SemiLight" w:hAnsi="Cascadia Mono SemiLight"/>
-          <w:sz w:val="20"/>
-        </w:rPr>
-        <w:t>correction_factor</w:t>
-      </w:r>
-      <w:r>
-        <w:t>, bu güç sıkışmasını azaltmak için kullanılmaktadır.</w:t>
-      </w:r>
-    </w:p>
-    <w:p>
       <w:pPr>
         <w:jc w:val="center"/>
       </w:pPr>
@@ -8538,9 +9772,9 @@
         </w:rPr>
         <w:drawing>
           <wp:inline distT="0" distB="0" distL="0" distR="0">
-            <wp:extent cx="5794674" cy="2945218"/>
-            <wp:effectExtent l="0" t="0" r="0" b="7620"/>
-            <wp:docPr id="12" name="Picture 12"/>
+            <wp:extent cx="5724939" cy="2882166"/>
+            <wp:effectExtent l="0" t="0" r="0" b="0"/>
+            <wp:docPr id="20" name="Picture 20"/>
             <wp:cNvGraphicFramePr>
               <a:graphicFrameLocks xmlns:a="http://schemas.openxmlformats.org/drawingml/2006/main" noChangeAspect="1"/>
             </wp:cNvGraphicFramePr>
@@ -8548,26 +9782,26 @@
               <a:graphicData uri="http://schemas.openxmlformats.org/drawingml/2006/picture">
                 <pic:pic xmlns:pic="http://schemas.openxmlformats.org/drawingml/2006/picture">
                   <pic:nvPicPr>
-                    <pic:cNvPr id="0" name="Picture 6"/>
+                    <pic:cNvPr id="0" name="Picture 5"/>
                     <pic:cNvPicPr>
                       <a:picLocks noChangeAspect="1" noChangeArrowheads="1"/>
                     </pic:cNvPicPr>
                   </pic:nvPicPr>
                   <pic:blipFill rotWithShape="1">
-                    <a:blip r:embed="rId16" cstate="print">
+                    <a:blip r:embed="rId24" cstate="print">
                       <a:extLst>
                         <a:ext uri="{28A0092B-C50C-407E-A947-70E740481C1C}">
                           <a14:useLocalDpi xmlns:a14="http://schemas.microsoft.com/office/drawing/2010/main" val="0"/>
                         </a:ext>
                       </a:extLst>
                     </a:blip>
-                    <a:srcRect l="8558" t="2990" r="5588" b="2487"/>
+                    <a:srcRect l="8698" t="3591" r="5707" b="3040"/>
                     <a:stretch/>
                   </pic:blipFill>
                   <pic:spPr bwMode="auto">
                     <a:xfrm>
                       <a:off x="0" y="0"/>
-                      <a:ext cx="5856690" cy="2976739"/>
+                      <a:ext cx="5758175" cy="2898898"/>
                     </a:xfrm>
                     <a:prstGeom prst="rect">
                       <a:avLst/>
@@ -8609,7 +9843,7 @@
           <w:i/>
           <w:sz w:val="18"/>
         </w:rPr>
-        <w:t>7</w:t>
+        <w:t>8</w:t>
       </w:r>
       <w:r>
         <w:rPr>
@@ -8648,6 +9882,15 @@
       </w:r>
     </w:p>
     <w:p>
+      <w:pPr>
+        <w:jc w:val="center"/>
+        <w:rPr>
+          <w:i/>
+          <w:sz w:val="18"/>
+        </w:rPr>
+      </w:pPr>
+    </w:p>
+    <w:p>
       <w:r>
         <w:t xml:space="preserve">Sabit 0,05 </w:t>
       </w:r>
@@ -8657,7 +9900,13 @@
       </w:r>
       <w:proofErr w:type="spellEnd"/>
       <w:r>
-        <w:t xml:space="preserve"> referans koşulunda en düşük gözlenen MAE 0,20 </w:t>
+        <w:t xml:space="preserve"> referans koşulunda en düşük gözlenen MAE 0,</w:t>
+      </w:r>
+      <w:r>
+        <w:t>5</w:t>
+      </w:r>
+      <w:r>
+        <w:t xml:space="preserve">0 </w:t>
       </w:r>
       <w:proofErr w:type="spellStart"/>
       <w:r>
@@ -8668,61 +9917,14 @@
         <w:t xml:space="preserve"> DUT RMS noktasında 0,</w:t>
       </w:r>
       <w:r>
-        <w:t>622</w:t>
+        <w:t>559</w:t>
+      </w:r>
+      <w:r>
+        <w:t xml:space="preserve"> dB'dir.</w:t>
       </w:r>
       <w:r>
         <w:t xml:space="preserve"> </w:t>
       </w:r>
-      <w:proofErr w:type="spellStart"/>
-      <w:r>
-        <w:t>dB'dir</w:t>
-      </w:r>
-      <w:proofErr w:type="spellEnd"/>
-      <w:r>
-        <w:t xml:space="preserve">. 0,50 </w:t>
-      </w:r>
-      <w:proofErr w:type="spellStart"/>
-      <w:r>
-        <w:t>rad</w:t>
-      </w:r>
-      <w:proofErr w:type="spellEnd"/>
-      <w:r>
-        <w:t xml:space="preserve"> noktasında MAE 0,</w:t>
-      </w:r>
-      <w:r>
-        <w:t>673</w:t>
-      </w:r>
-      <w:r>
-        <w:t xml:space="preserve"> </w:t>
-      </w:r>
-      <w:proofErr w:type="spellStart"/>
-      <w:r>
-        <w:t>dB'ye</w:t>
-      </w:r>
-      <w:proofErr w:type="spellEnd"/>
-      <w:r>
-        <w:t xml:space="preserve"> yükselirken düzeltme katsayısı 1,</w:t>
-      </w:r>
-      <w:r>
-        <w:t>2952</w:t>
-      </w:r>
-      <w:r>
-        <w:t xml:space="preserve"> olmuştur. Katsayının birden sapması yaklaşık %</w:t>
-      </w:r>
-      <w:r>
-        <w:t>29</w:t>
-      </w:r>
-      <w:r>
-        <w:t>,</w:t>
-      </w:r>
-      <w:r>
-        <w:t>5</w:t>
-      </w:r>
-      <w:r>
-        <w:t xml:space="preserve"> olup yüksek faz RMS değerlerinde küçük-açı yaklaşımından uzaklaşmanın önem kazandığını gösterir. Bu nokta genel donanım çalışma sınırı değildir.</w:t>
-      </w:r>
-    </w:p>
-    <w:p>
       <w:r>
         <w:t xml:space="preserve">Bu simülasyonda farkın daha net görünmesi amacı ile iterasyon sayısı düşük tutuldu, </w:t>
       </w:r>
@@ -8740,13 +9942,20 @@
     <w:p/>
     <w:p/>
     <w:p/>
+    <w:p/>
+    <w:p/>
+    <w:p/>
+    <w:p/>
     <w:p>
       <w:pPr>
         <w:pStyle w:val="Heading2"/>
       </w:pPr>
       <w:r>
         <w:lastRenderedPageBreak/>
-        <w:t>7.</w:t>
+        <w:t>8</w:t>
+      </w:r>
+      <w:r>
+        <w:t>.</w:t>
       </w:r>
       <w:r>
         <w:t>4</w:t>
@@ -8829,20 +10038,27 @@
         <w:t>bağımsız realizasyonlardır. İdeal olarak sonsuz sayıda ortalamada referans gürültüsü tamamen bastırılır. Ancak sonlu iterasyon sayısında referans RMS değeri yükseldikçe kalan rastgele hata ve MAE artabilir.</w:t>
       </w:r>
     </w:p>
-    <w:p/>
     <w:p>
       <w:pPr>
         <w:jc w:val="center"/>
-      </w:pPr>
-      <w:r>
         <w:rPr>
           <w:noProof/>
         </w:rPr>
+      </w:pPr>
+    </w:p>
+    <w:p>
+      <w:pPr>
+        <w:jc w:val="center"/>
+      </w:pPr>
+      <w:r>
+        <w:rPr>
+          <w:noProof/>
+        </w:rPr>
         <w:drawing>
-          <wp:inline distT="0" distB="0" distL="0" distR="0" wp14:anchorId="0FBB5E22" wp14:editId="2216F4AD">
-            <wp:extent cx="5809411" cy="3006547"/>
-            <wp:effectExtent l="0" t="0" r="1270" b="3810"/>
-            <wp:docPr id="11" name="Picture 11" descr="Şekil 7.3. İki referans RMS değerinin birlikte taranması. N=1.000.000; DUT RMS=0,05 rad; 100 yineleme. Kaynak: Bu çalışma." title="Şekil 7"/>
+          <wp:inline distT="0" distB="0" distL="0" distR="0">
+            <wp:extent cx="5719572" cy="2805417"/>
+            <wp:effectExtent l="0" t="0" r="0" b="0"/>
+            <wp:docPr id="23" name="Picture 23"/>
             <wp:cNvGraphicFramePr>
               <a:graphicFrameLocks xmlns:a="http://schemas.openxmlformats.org/drawingml/2006/main" noChangeAspect="1"/>
             </wp:cNvGraphicFramePr>
@@ -8850,23 +10066,39 @@
               <a:graphicData uri="http://schemas.openxmlformats.org/drawingml/2006/picture">
                 <pic:pic xmlns:pic="http://schemas.openxmlformats.org/drawingml/2006/picture">
                   <pic:nvPicPr>
-                    <pic:cNvPr id="0" name="rms_ref_comparison.png"/>
-                    <pic:cNvPicPr/>
+                    <pic:cNvPr id="0" name="Picture 7"/>
+                    <pic:cNvPicPr>
+                      <a:picLocks noChangeAspect="1" noChangeArrowheads="1"/>
+                    </pic:cNvPicPr>
                   </pic:nvPicPr>
-                  <pic:blipFill>
-                    <a:blip r:embed="rId17"/>
-                    <a:stretch>
-                      <a:fillRect/>
-                    </a:stretch>
+                  <pic:blipFill rotWithShape="1">
+                    <a:blip r:embed="rId25" cstate="print">
+                      <a:extLst>
+                        <a:ext uri="{28A0092B-C50C-407E-A947-70E740481C1C}">
+                          <a14:useLocalDpi xmlns:a14="http://schemas.microsoft.com/office/drawing/2010/main" val="0"/>
+                        </a:ext>
+                      </a:extLst>
+                    </a:blip>
+                    <a:srcRect l="8268" t="4302" r="4751" b="3177"/>
+                    <a:stretch/>
                   </pic:blipFill>
-                  <pic:spPr>
+                  <pic:spPr bwMode="auto">
                     <a:xfrm>
                       <a:off x="0" y="0"/>
-                      <a:ext cx="5836237" cy="3020430"/>
+                      <a:ext cx="5775138" cy="2832672"/>
                     </a:xfrm>
                     <a:prstGeom prst="rect">
                       <a:avLst/>
                     </a:prstGeom>
+                    <a:noFill/>
+                    <a:ln>
+                      <a:noFill/>
+                    </a:ln>
+                    <a:extLst>
+                      <a:ext uri="{53640926-AAD7-44D8-BBD7-CCE9431645EC}">
+                        <a14:shadowObscured xmlns:a14="http://schemas.microsoft.com/office/drawing/2010/main"/>
+                      </a:ext>
+                    </a:extLst>
                   </pic:spPr>
                 </pic:pic>
               </a:graphicData>
@@ -8888,120 +10120,163 @@
           <w:i/>
           <w:sz w:val="18"/>
         </w:rPr>
+        <w:t>Şekil</w:t>
+      </w:r>
+      <w:r>
+        <w:rPr>
+          <w:i/>
+          <w:sz w:val="18"/>
+        </w:rPr>
+        <w:t xml:space="preserve"> 8</w:t>
+      </w:r>
+      <w:r>
+        <w:rPr>
+          <w:i/>
+          <w:sz w:val="18"/>
+        </w:rPr>
+        <w:t>.</w:t>
+      </w:r>
+      <w:r>
+        <w:rPr>
+          <w:i/>
+          <w:sz w:val="18"/>
+        </w:rPr>
+        <w:t>3</w:t>
+      </w:r>
+      <w:r>
+        <w:rPr>
+          <w:i/>
+          <w:sz w:val="18"/>
+        </w:rPr>
+        <w:t xml:space="preserve"> – </w:t>
+      </w:r>
+      <w:r>
+        <w:rPr>
+          <w:i/>
+          <w:sz w:val="18"/>
+        </w:rPr>
+        <w:t xml:space="preserve">Farklı </w:t>
+      </w:r>
+      <w:r>
+        <w:rPr>
+          <w:i/>
+          <w:sz w:val="18"/>
+        </w:rPr>
+        <w:t>referans RMS değerlerinde cross-PSD ve gerçek DUT faz gürültüsü</w:t>
+      </w:r>
+    </w:p>
+    <w:p>
+      <w:pPr>
+        <w:jc w:val="center"/>
+        <w:rPr>
+          <w:i/>
+          <w:sz w:val="18"/>
+        </w:rPr>
+      </w:pPr>
+    </w:p>
+    <w:p>
+      <w:r>
+        <w:t>Referans RMS 0,0</w:t>
+      </w:r>
+      <w:r>
+        <w:t>1</w:t>
+      </w:r>
+      <w:r>
+        <w:t xml:space="preserve"> </w:t>
+      </w:r>
+      <w:proofErr w:type="spellStart"/>
+      <w:r>
+        <w:t>rad</w:t>
+      </w:r>
+      <w:proofErr w:type="spellEnd"/>
+      <w:r>
+        <w:t xml:space="preserve"> iken MAE </w:t>
+      </w:r>
+      <w:r>
+        <w:t>0,549</w:t>
+      </w:r>
+      <w:r>
+        <w:t xml:space="preserve"> dB, 0,50 </w:t>
+      </w:r>
+      <w:proofErr w:type="spellStart"/>
+      <w:r>
+        <w:t>rad</w:t>
+      </w:r>
+      <w:proofErr w:type="spellEnd"/>
+      <w:r>
+        <w:t xml:space="preserve"> iken </w:t>
+      </w:r>
+      <w:r>
+        <w:t>4,805</w:t>
+      </w:r>
+      <w:r>
+        <w:t xml:space="preserve"> dB'dir; mutlak fark</w:t>
+      </w:r>
+      <w:r>
+        <w:br/>
+        <w:t>4,256</w:t>
+      </w:r>
+      <w:r>
+        <w:t xml:space="preserve"> dB'dir. </w:t>
+      </w:r>
+      <w:r>
+        <w:t xml:space="preserve">Bu değer fonksiyonun küçük sinyal yaklaşımı kullanılan versiyonunda yüksek RMS değerinin uyumsuzluğundan ötürü yaklaşık 8 </w:t>
+      </w:r>
+      <w:proofErr w:type="spellStart"/>
+      <w:r>
+        <w:t>dB’in</w:t>
+      </w:r>
+      <w:proofErr w:type="spellEnd"/>
+      <w:r>
+        <w:t xml:space="preserve"> üzerindeydi.</w:t>
+      </w:r>
+    </w:p>
+    <w:p>
+      <w:r>
+        <w:t>Bu taramada yüksek referans gürültüsünün sonlu 100 yinelemede</w:t>
+      </w:r>
+      <w:r>
+        <w:t xml:space="preserve">, düşük </w:t>
+      </w:r>
+      <w:proofErr w:type="spellStart"/>
+      <w:r>
+        <w:t>RMS’e</w:t>
+      </w:r>
+      <w:proofErr w:type="spellEnd"/>
+      <w:r>
+        <w:t xml:space="preserve"> göre</w:t>
+      </w:r>
+      <w:r>
+        <w:t xml:space="preserve"> daha fazla artık bileşen oluşturduğu görülmüştür. Değer sırası incelendiğinde MAE artışları</w:t>
+      </w:r>
+      <w:r>
+        <w:t xml:space="preserve">nın RMS artışı ile doğru orantılı olduğu sonuçlarda </w:t>
+      </w:r>
+      <w:r>
+        <w:t>görülmüştür.</w:t>
+      </w:r>
+    </w:p>
+    <w:p>
+      <w:r>
+        <w:t xml:space="preserve">Bakıldığı zaman </w:t>
+      </w:r>
+      <w:r>
+        <w:rPr>
+          <w:i/>
+        </w:rPr>
         <w:t xml:space="preserve">Şekil </w:t>
       </w:r>
       <w:r>
         <w:rPr>
           <w:i/>
-          <w:sz w:val="18"/>
-        </w:rPr>
-        <w:t>7</w:t>
-      </w:r>
-      <w:r>
-        <w:rPr>
-          <w:i/>
-          <w:sz w:val="18"/>
-        </w:rPr>
-        <w:t>.</w:t>
-      </w:r>
-      <w:r>
-        <w:rPr>
-          <w:i/>
-          <w:sz w:val="18"/>
-        </w:rPr>
-        <w:t>3</w:t>
-      </w:r>
-      <w:r>
-        <w:rPr>
-          <w:i/>
-          <w:sz w:val="18"/>
-        </w:rPr>
-        <w:t xml:space="preserve"> – </w:t>
-      </w:r>
-      <w:r>
-        <w:rPr>
-          <w:i/>
-          <w:sz w:val="18"/>
-        </w:rPr>
-        <w:t xml:space="preserve">Farklı </w:t>
-      </w:r>
-      <w:r>
-        <w:rPr>
-          <w:i/>
-          <w:sz w:val="18"/>
-        </w:rPr>
-        <w:t>referans RMS değerlerinde cross-PSD ve gerçek DUT faz gürültüsü</w:t>
-      </w:r>
-    </w:p>
-    <w:p>
-      <w:pPr>
-        <w:jc w:val="center"/>
-        <w:rPr>
-          <w:i/>
-          <w:sz w:val="18"/>
-        </w:rPr>
-      </w:pPr>
-    </w:p>
-    <w:p>
-      <w:r>
-        <w:t xml:space="preserve">Referans RMS 0,05 </w:t>
-      </w:r>
-      <w:proofErr w:type="spellStart"/>
-      <w:r>
-        <w:t>rad</w:t>
-      </w:r>
-      <w:proofErr w:type="spellEnd"/>
-      <w:r>
-        <w:t xml:space="preserve"> iken MAE 1,603 </w:t>
-      </w:r>
-      <w:proofErr w:type="spellStart"/>
-      <w:r>
-        <w:t>dB</w:t>
-      </w:r>
-      <w:proofErr w:type="spellEnd"/>
-      <w:r>
-        <w:t xml:space="preserve">, 0,50 </w:t>
-      </w:r>
-      <w:proofErr w:type="spellStart"/>
-      <w:r>
-        <w:t>rad</w:t>
-      </w:r>
-      <w:proofErr w:type="spellEnd"/>
-      <w:r>
-        <w:t xml:space="preserve"> iken 9,518 </w:t>
-      </w:r>
-      <w:proofErr w:type="spellStart"/>
-      <w:r>
-        <w:t>dB'dir</w:t>
-      </w:r>
-      <w:proofErr w:type="spellEnd"/>
-      <w:r>
-        <w:t xml:space="preserve">; mutlak fark 7,915 </w:t>
-      </w:r>
-      <w:proofErr w:type="spellStart"/>
-      <w:r>
-        <w:t>dB'dir</w:t>
-      </w:r>
-      <w:proofErr w:type="spellEnd"/>
-      <w:r>
-        <w:t>. Bu taramada yüksek referans gürültüsünün sonlu 100 yinelemede daha fazla artık bileşen oluşturduğu görülmüştür. Değer sırası incelendiğinde MAE artışları</w:t>
-      </w:r>
-      <w:r>
-        <w:t xml:space="preserve">nın RMS artışı ile doğru orantılı olduğu sonuçlarda </w:t>
-      </w:r>
-      <w:r>
-        <w:t>görülmüştür.</w:t>
-      </w:r>
-    </w:p>
-    <w:p>
-      <w:r>
-        <w:t xml:space="preserve">Bakıldığı zaman </w:t>
-      </w:r>
-      <w:r>
-        <w:rPr>
-          <w:i/>
-        </w:rPr>
-        <w:t>Şekil 7.3</w:t>
+        </w:rPr>
+        <w:t>8</w:t>
+      </w:r>
+      <w:r>
+        <w:rPr>
+          <w:i/>
+        </w:rPr>
+        <w:t>.3</w:t>
       </w:r>
       <w:r>
         <w:t xml:space="preserve"> ve </w:t>
@@ -9010,7 +10285,19 @@
         <w:rPr>
           <w:i/>
         </w:rPr>
-        <w:t>Şekil 7.2</w:t>
+        <w:t xml:space="preserve">Şekil </w:t>
+      </w:r>
+      <w:r>
+        <w:rPr>
+          <w:i/>
+        </w:rPr>
+        <w:t>8</w:t>
+      </w:r>
+      <w:r>
+        <w:rPr>
+          <w:i/>
+        </w:rPr>
+        <w:t>.2</w:t>
       </w:r>
       <w:r>
         <w:t xml:space="preserve"> aynı tür parametreleri değiştiği ve bu parametrelerin varsayılan değerleri aynı olduğu için birbirleri ile aynı gözükse de referans değerinin testi bize ölçüm cihazının referans sinyal RMS değerinin düşük olmasının önemini gösteriyor. Yüksek RMS değerine sahip bir ölçüm cihazı ölçüm doğruluğu için çok daha fazla iterasyon, çok daha fazla iterasyon da zaman ve enerji isteyecektir.</w:t>
@@ -9027,44 +10314,44 @@
         <w:pStyle w:val="Heading2"/>
       </w:pPr>
       <w:r>
-        <w:lastRenderedPageBreak/>
-        <w:t>7.5. Logaritmik bin sayısının etkisi</w:t>
-      </w:r>
-    </w:p>
-    <w:p>
-      <w:r>
-        <w:t xml:space="preserve">Bu tek taramada en düşük gözlenen MAE 100 bin için 1,396 </w:t>
+        <w:t>8</w:t>
+      </w:r>
+      <w:r>
+        <w:t>.5. Logaritmik bin sayısının etkisi</w:t>
+      </w:r>
+    </w:p>
+    <w:p>
+      <w:r>
+        <w:t xml:space="preserve">Bu tek taramada en düşük gözlenen MAE 100 bin için </w:t>
+      </w:r>
+      <w:r>
+        <w:t>0,682</w:t>
+      </w:r>
+      <w:r>
+        <w:t xml:space="preserve"> dB'dir ve MAE artışı 100→200 geçişinde görülmüştür. Her bin değeri için yeni rastgele </w:t>
       </w:r>
       <w:proofErr w:type="spellStart"/>
       <w:r>
-        <w:t>dB'dir</w:t>
+        <w:t>gerçekleşimler</w:t>
       </w:r>
       <w:proofErr w:type="spellEnd"/>
       <w:r>
-        <w:t xml:space="preserve"> ve MAE artışı 100→200 geçişinde görülmüştür. Her bin değeri için yeni rastgele </w:t>
+        <w:t xml:space="preserve"> üretildiğinden fark yalnız binleme çözünürlüğüne bağlanamaz. Aynı tam çözünürlüklü </w:t>
       </w:r>
       <w:proofErr w:type="spellStart"/>
       <w:r>
-        <w:t>gerçekleşimler</w:t>
+        <w:t>PSD'nin</w:t>
       </w:r>
       <w:proofErr w:type="spellEnd"/>
       <w:r>
-        <w:t xml:space="preserve"> üretildiğinden fark yalnız binleme çözünürlüğüne bağlanamaz. Aynı tam çözünürlüklü </w:t>
+        <w:t xml:space="preserve"> yeniden </w:t>
       </w:r>
       <w:proofErr w:type="spellStart"/>
       <w:r>
-        <w:t>PSD'nin</w:t>
+        <w:t>binlenmesi</w:t>
       </w:r>
       <w:proofErr w:type="spellEnd"/>
       <w:r>
-        <w:t xml:space="preserve"> yeniden </w:t>
-      </w:r>
-      <w:proofErr w:type="spellStart"/>
-      <w:r>
-        <w:t>binlenmesi</w:t>
-      </w:r>
-      <w:proofErr w:type="spellEnd"/>
-      <w:r>
         <w:t xml:space="preserve"> yapılmadan istatistiksel optimum iddiası kurulmamıştır.</w:t>
       </w:r>
       <w:r>
@@ -9081,10 +10368,10 @@
           <w:noProof/>
         </w:rPr>
         <w:drawing>
-          <wp:inline distT="0" distB="0" distL="0" distR="0" wp14:anchorId="146140AE" wp14:editId="71FB0257">
-            <wp:extent cx="5760720" cy="2979466"/>
-            <wp:effectExtent l="0" t="0" r="0" b="0"/>
-            <wp:docPr id="15" name="Picture 15" descr="Şekil 7.5. Logaritmik bin sayısının spektral gösterime ve tam bant MAE'ye etkisi. N=1.000.000; temel profil. Kaynak: Bu çalışma." title="Şekil 7"/>
+          <wp:inline distT="0" distB="0" distL="0" distR="0">
+            <wp:extent cx="5767602" cy="2833635"/>
+            <wp:effectExtent l="0" t="0" r="5080" b="5080"/>
+            <wp:docPr id="24" name="Picture 24"/>
             <wp:cNvGraphicFramePr>
               <a:graphicFrameLocks xmlns:a="http://schemas.openxmlformats.org/drawingml/2006/main" noChangeAspect="1"/>
             </wp:cNvGraphicFramePr>
@@ -9092,23 +10379,39 @@
               <a:graphicData uri="http://schemas.openxmlformats.org/drawingml/2006/picture">
                 <pic:pic xmlns:pic="http://schemas.openxmlformats.org/drawingml/2006/picture">
                   <pic:nvPicPr>
-                    <pic:cNvPr id="0" name="log_bins_comparison.png"/>
-                    <pic:cNvPicPr/>
+                    <pic:cNvPr id="0" name="Picture 9"/>
+                    <pic:cNvPicPr>
+                      <a:picLocks noChangeAspect="1" noChangeArrowheads="1"/>
+                    </pic:cNvPicPr>
                   </pic:nvPicPr>
-                  <pic:blipFill>
-                    <a:blip r:embed="rId18"/>
-                    <a:stretch>
-                      <a:fillRect/>
-                    </a:stretch>
+                  <pic:blipFill rotWithShape="1">
+                    <a:blip r:embed="rId26" cstate="print">
+                      <a:extLst>
+                        <a:ext uri="{28A0092B-C50C-407E-A947-70E740481C1C}">
+                          <a14:useLocalDpi xmlns:a14="http://schemas.microsoft.com/office/drawing/2010/main" val="0"/>
+                        </a:ext>
+                      </a:extLst>
+                    </a:blip>
+                    <a:srcRect l="8461" t="4919" r="5423" b="3311"/>
+                    <a:stretch/>
                   </pic:blipFill>
-                  <pic:spPr>
+                  <pic:spPr bwMode="auto">
                     <a:xfrm>
                       <a:off x="0" y="0"/>
-                      <a:ext cx="5760720" cy="2979466"/>
+                      <a:ext cx="5797963" cy="2848551"/>
                     </a:xfrm>
                     <a:prstGeom prst="rect">
                       <a:avLst/>
                     </a:prstGeom>
+                    <a:noFill/>
+                    <a:ln>
+                      <a:noFill/>
+                    </a:ln>
+                    <a:extLst>
+                      <a:ext uri="{53640926-AAD7-44D8-BBD7-CCE9431645EC}">
+                        <a14:shadowObscured xmlns:a14="http://schemas.microsoft.com/office/drawing/2010/main"/>
+                      </a:ext>
+                    </a:extLst>
                   </pic:spPr>
                 </pic:pic>
               </a:graphicData>
@@ -9137,7 +10440,7 @@
           <w:i/>
           <w:sz w:val="18"/>
         </w:rPr>
-        <w:t>7</w:t>
+        <w:t>8</w:t>
       </w:r>
       <w:r>
         <w:rPr>
@@ -9260,8 +10563,10 @@
         <w:pStyle w:val="Heading2"/>
       </w:pPr>
       <w:r>
-        <w:lastRenderedPageBreak/>
-        <w:t>7.</w:t>
+        <w:t>8</w:t>
+      </w:r>
+      <w:r>
+        <w:t>.</w:t>
       </w:r>
       <w:r>
         <w:t>6</w:t>
@@ -9394,59 +10699,24 @@
           <w:rPr>
             <w:rFonts w:ascii="Cambria Math" w:hAnsi="Cambria Math"/>
           </w:rPr>
-          <m:t>=0.05</m:t>
+          <m:t>=0.</m:t>
         </m:r>
-      </m:oMath>
-      <w:r>
-        <w:rPr>
-          <w:rFonts w:eastAsiaTheme="minorEastAsia"/>
-        </w:rPr>
-        <w:tab/>
-      </w:r>
-      <m:oMath>
-        <m:sSub>
-          <m:sSubPr>
-            <m:ctrlPr>
-              <w:rPr>
-                <w:rFonts w:ascii="Cambria Math" w:hAnsi="Cambria Math"/>
-                <w:i/>
-              </w:rPr>
-            </m:ctrlPr>
-          </m:sSubPr>
-          <m:e>
-            <m:r>
-              <w:rPr>
-                <w:rFonts w:ascii="Cambria Math" w:hAnsi="Cambria Math"/>
-              </w:rPr>
-              <m:t>f</m:t>
-            </m:r>
-          </m:e>
-          <m:sub>
-            <m:r>
-              <w:rPr>
-                <w:rFonts w:ascii="Cambria Math" w:hAnsi="Cambria Math"/>
-              </w:rPr>
-              <m:t>cutoff</m:t>
-            </m:r>
-          </m:sub>
-        </m:sSub>
         <m:r>
           <w:rPr>
             <w:rFonts w:ascii="Cambria Math" w:hAnsi="Cambria Math"/>
           </w:rPr>
-          <m:t>=</m:t>
-        </m:r>
-        <m:r>
-          <w:rPr>
-            <w:rFonts w:ascii="Cambria Math" w:eastAsiaTheme="minorEastAsia" w:hAnsi="Cambria Math"/>
-          </w:rPr>
-          <m:t>100kHz</m:t>
+          <m:t>1</m:t>
         </m:r>
       </m:oMath>
     </w:p>
     <w:p>
-      <w:r>
-        <w:t>olarak güncellenmiştir.</w:t>
+      <w:proofErr w:type="gramStart"/>
+      <w:r>
+        <w:t>olarak</w:t>
+      </w:r>
+      <w:proofErr w:type="gramEnd"/>
+      <w:r>
+        <w:t xml:space="preserve"> güncellenmiştir.</w:t>
       </w:r>
     </w:p>
     <w:p>
@@ -9561,15 +10831,14 @@
       <w:pPr>
         <w:jc w:val="center"/>
       </w:pPr>
-      <w:bookmarkStart w:id="1" w:name="_GoBack"/>
       <w:r>
         <w:rPr>
           <w:noProof/>
         </w:rPr>
         <w:drawing>
           <wp:inline distT="0" distB="0" distL="0" distR="0" wp14:anchorId="050CB32A" wp14:editId="5341F9F8">
-            <wp:extent cx="5430741" cy="4026982"/>
-            <wp:effectExtent l="0" t="0" r="0" b="0"/>
+            <wp:extent cx="5104263" cy="3784893"/>
+            <wp:effectExtent l="0" t="0" r="1270" b="6350"/>
             <wp:docPr id="14" name="Picture 14" descr="Şekil 7.6. Özel N=1.000.000 profilde final uzun yineleme taraması. LPF=100 kHz; DUT RMS=0,02 rad; Ref1=Ref2=0,05 rad; 100 log-bin. Kaynak: Bu çalışma." title="Şekil 7"/>
             <wp:cNvGraphicFramePr>
               <a:graphicFrameLocks xmlns:a="http://schemas.openxmlformats.org/drawingml/2006/main" noChangeAspect="1"/>
@@ -9582,7 +10851,7 @@
                     <pic:cNvPicPr/>
                   </pic:nvPicPr>
                   <pic:blipFill>
-                    <a:blip r:embed="rId19"/>
+                    <a:blip r:embed="rId27"/>
                     <a:stretch>
                       <a:fillRect/>
                     </a:stretch>
@@ -9590,7 +10859,7 @@
                   <pic:spPr>
                     <a:xfrm>
                       <a:off x="0" y="0"/>
-                      <a:ext cx="5484379" cy="4066755"/>
+                      <a:ext cx="5156742" cy="3823807"/>
                     </a:xfrm>
                     <a:prstGeom prst="rect">
                       <a:avLst/>
@@ -9602,7 +10871,6 @@
           </wp:inline>
         </w:drawing>
       </w:r>
-      <w:bookmarkEnd w:id="1"/>
     </w:p>
     <w:p>
       <w:pPr>
@@ -9617,14 +10885,14 @@
           <w:i/>
           <w:sz w:val="18"/>
         </w:rPr>
-        <w:t xml:space="preserve">Şekil </w:t>
-      </w:r>
-      <w:r>
-        <w:rPr>
-          <w:i/>
-          <w:sz w:val="18"/>
-        </w:rPr>
-        <w:t>7</w:t>
+        <w:t>Şekil</w:t>
+      </w:r>
+      <w:r>
+        <w:rPr>
+          <w:i/>
+          <w:sz w:val="18"/>
+        </w:rPr>
+        <w:t xml:space="preserve"> 8</w:t>
       </w:r>
       <w:r>
         <w:rPr>
@@ -9689,58 +10957,93 @@
     </w:p>
     <w:p>
       <w:r>
-        <w:t xml:space="preserve">Referans PSD seviyesinin DUT'den teorik olarak yaklaşık 7,96 </w:t>
+        <w:t>Referans PSD seviyesinin DUT'den teorik olarak yaklaşık 7,96 dB yüksek olduğu özel profilde, 1 yinelemede 6,958 dB olan tam bant MAE 20.000 yinelemede 1,437 dB olmuştur. İlk-son azalma 5,521 dB'dir ve 10.000→20.000 geçişinde MAE artışı görülmüştür.</w:t>
+      </w:r>
+    </w:p>
+    <w:p>
+      <w:r>
+        <w:t>10.000→20.000 geçişindeki MAE değişimi 0,071 dB olmuştur. MAE değişiminin işareti tek başına 20.000 noktasının daha iyi veya kötü olduğunu kanıtlamaz; final değerlendirme tek koşulu Monte Carlo dalgalanması ve geniş bant sistematik tabanla birlikte yapılmıştır.</w:t>
+      </w:r>
+    </w:p>
+    <w:p>
+      <w:pPr>
+        <w:pStyle w:val="Heading1"/>
+        <w:rPr>
+          <w:b/>
+        </w:rPr>
+      </w:pPr>
+      <w:r>
+        <w:rPr>
+          <w:b/>
+        </w:rPr>
+        <w:lastRenderedPageBreak/>
+        <w:t>9. Sonuç ve gelecek çalışmalar</w:t>
+      </w:r>
+    </w:p>
+    <w:p>
+      <w:r>
+        <w:t xml:space="preserve">Bu projede iki referans kanallı faz </w:t>
       </w:r>
       <w:proofErr w:type="spellStart"/>
       <w:r>
-        <w:t>dB</w:t>
+        <w:t>dedektörü</w:t>
       </w:r>
       <w:proofErr w:type="spellEnd"/>
       <w:r>
-        <w:t xml:space="preserve"> yüksek olduğu özel profilde, 1 yinelemede 6,958 </w:t>
+        <w:t xml:space="preserve"> mimarisi GNU </w:t>
       </w:r>
       <w:proofErr w:type="spellStart"/>
       <w:r>
-        <w:t>dB</w:t>
+        <w:t>Octave</w:t>
       </w:r>
       <w:proofErr w:type="spellEnd"/>
       <w:r>
-        <w:t xml:space="preserve"> olan tam bant MAE 20.000 yinelemede 1,437 </w:t>
+        <w:t xml:space="preserve"> ortamında gerçekleştirilmiş, DUT faz gürültüsü Kompleks Cross-PSD ortalamasıyla kestirilmiş ve aynı Monte Carlı popülasyonunun filtresiz DUT </w:t>
       </w:r>
       <w:proofErr w:type="spellStart"/>
       <w:r>
-        <w:t>dB</w:t>
+        <w:t>periodogramıyla</w:t>
       </w:r>
       <w:proofErr w:type="spellEnd"/>
       <w:r>
-        <w:t xml:space="preserve"> olmuştur. İlk-son azalma 5,521 </w:t>
+        <w:t xml:space="preserve"> karşılaştırılmıştır. Fiziksel çapraz korelasyon ilkesi ile kodda kullanılan frekans bölgesi Cross-PSD kestiricisi ayrı biçimde tanımlanmıştır.</w:t>
+      </w:r>
+    </w:p>
+    <w:p>
+      <w:r>
+        <w:t>Özellikle LPF kesim frekansının, DUT ve referans sinyallerinin RMS değerlerinin ve iterasyon sayılarının önemi karşılaştırmalarda daha iyi anlaşılmış, logaritmik bin sayısının gözleme etkisi görülmüştür.</w:t>
+      </w:r>
+    </w:p>
+    <w:p>
+      <w:r>
+        <w:t>Çıkarılabilecek en önemli sonuç referans RMS değerinin olabildiğince düşük olmasının gerektiği, düşük olmasa dahi</w:t>
+      </w:r>
+      <w:r>
+        <w:t xml:space="preserve"> </w:t>
+      </w:r>
+      <w:r>
+        <w:t xml:space="preserve">yüksek iterasyon sayıları ile </w:t>
+      </w:r>
+      <w:r>
+        <w:t>bu problemin aşılabildiği olmuştur.</w:t>
+      </w:r>
+    </w:p>
+    <w:p>
+      <w:r>
+        <w:t xml:space="preserve">Bundan sonra modelin doğruluğu gerçek veriler ile test edilip, faz analizörü çıktıları ile </w:t>
       </w:r>
       <w:proofErr w:type="spellStart"/>
       <w:r>
-        <w:t>dB'dir</w:t>
+        <w:t>karşılaştırılacaktur</w:t>
       </w:r>
       <w:proofErr w:type="spellEnd"/>
       <w:r>
-        <w:t xml:space="preserve"> ve 10.000→20.000 geçişinde MAE artışı görülmüştür.</w:t>
-      </w:r>
-    </w:p>
-    <w:p>
-      <w:r>
-        <w:t xml:space="preserve">10.000→20.000 geçişindeki MAE değişimi 0,071 </w:t>
-      </w:r>
-      <w:proofErr w:type="spellStart"/>
-      <w:r>
-        <w:t>dB</w:t>
-      </w:r>
-      <w:proofErr w:type="spellEnd"/>
-      <w:r>
-        <w:t xml:space="preserve"> olmuştur. MAE değişiminin işareti tek başına 20.000 noktasının daha iyi veya kötü olduğunu kanıtlamaz; final değerlendirme tek koşulu Monte Carlo dalgalanması ve geniş bant sistematik tabanla birlikte yapılmıştır.</w:t>
-      </w:r>
-    </w:p>
-    <w:p/>
+        <w:t>.</w:t>
+      </w:r>
+    </w:p>
     <w:sectPr>
-      <w:headerReference w:type="default" r:id="rId20"/>
-      <w:footerReference w:type="default" r:id="rId21"/>
+      <w:headerReference w:type="default" r:id="rId28"/>
+      <w:footerReference w:type="default" r:id="rId29"/>
       <w:pgSz w:w="11906" w:h="16838"/>
       <w:pgMar w:top="1417" w:right="1417" w:bottom="1417" w:left="1417" w:header="708" w:footer="708" w:gutter="0"/>
       <w:cols w:space="708"/>
@@ -10832,7 +12135,7 @@
   <w:style w:type="paragraph" w:default="1" w:styleId="Normal">
     <w:name w:val="Normal"/>
     <w:qFormat/>
-    <w:rsid w:val="00B950B0"/>
+    <w:rsid w:val="00BE079B"/>
     <w:pPr>
       <w:jc w:val="both"/>
     </w:pPr>
@@ -11344,6 +12647,37 @@
       <w:sz w:val="23"/>
     </w:rPr>
   </w:style>
+  <w:style w:type="paragraph" w:styleId="Subtitle">
+    <w:name w:val="Subtitle"/>
+    <w:basedOn w:val="Normal"/>
+    <w:next w:val="Normal"/>
+    <w:link w:val="SubtitleChar"/>
+    <w:uiPriority w:val="11"/>
+    <w:qFormat/>
+    <w:rsid w:val="00DE5C7D"/>
+    <w:pPr>
+      <w:numPr>
+        <w:ilvl w:val="1"/>
+      </w:numPr>
+    </w:pPr>
+    <w:rPr>
+      <w:rFonts w:asciiTheme="minorHAnsi" w:eastAsiaTheme="minorEastAsia" w:hAnsiTheme="minorHAnsi"/>
+      <w:color w:val="5A5A5A" w:themeColor="text1" w:themeTint="A5"/>
+      <w:spacing w:val="15"/>
+    </w:rPr>
+  </w:style>
+  <w:style w:type="character" w:customStyle="1" w:styleId="SubtitleChar">
+    <w:name w:val="Subtitle Char"/>
+    <w:basedOn w:val="DefaultParagraphFont"/>
+    <w:link w:val="Subtitle"/>
+    <w:uiPriority w:val="11"/>
+    <w:rsid w:val="00DE5C7D"/>
+    <w:rPr>
+      <w:rFonts w:eastAsiaTheme="minorEastAsia"/>
+      <w:color w:val="5A5A5A" w:themeColor="text1" w:themeTint="A5"/>
+      <w:spacing w:val="15"/>
+    </w:rPr>
+  </w:style>
 </w:styles>
 </file>
 
@@ -11640,4 +12974,16 @@
     </a:ext>
   </a:extLst>
 </a:theme>
+</file>
+
+<file path=customXml/item1.xml><?xml version="1.0" encoding="utf-8"?>
+<b:Sources xmlns:b="http://schemas.openxmlformats.org/officeDocument/2006/bibliography" xmlns="http://schemas.openxmlformats.org/officeDocument/2006/bibliography" SelectedStyle="\APASixthEditionOfficeOnline.xsl" StyleName="APA" Version="6"/>
+</file>
+
+<file path=customXml/itemProps1.xml><?xml version="1.0" encoding="utf-8"?>
+<ds:datastoreItem xmlns:ds="http://schemas.openxmlformats.org/officeDocument/2006/customXml" ds:itemID="{14CD163F-A6B6-456B-953C-13D84C29177F}">
+  <ds:schemaRefs>
+    <ds:schemaRef ds:uri="http://schemas.openxmlformats.org/officeDocument/2006/bibliography"/>
+  </ds:schemaRefs>
+</ds:datastoreItem>
 </file>
</xml_diff>

<commit_message>
Update report iteration analysis
</commit_message>
<xml_diff>
--- a/İki Kanallı Cross.docx
+++ b/İki Kanallı Cross.docx
@@ -10580,7 +10580,7 @@
     </w:p>
     <w:p>
       <w:r>
-        <w:t>Test edilen değerler:</w:t>
+        <w:t>Test edilen iterasyon sayıları:</w:t>
       </w:r>
     </w:p>
     <w:p>
@@ -10589,36 +10589,23 @@
           <w:rFonts w:eastAsiaTheme="minorEastAsia"/>
         </w:rPr>
       </w:pPr>
-      <m:oMathPara>
-        <m:oMath>
-          <m:r>
-            <w:rPr>
-              <w:rFonts w:ascii="Cambria Math" w:hAnsi="Cambria Math"/>
-            </w:rPr>
-            <m:t>M=[1, 10, 100, 250, 500, 1000, 5000, 10000, 20000]</m:t>
-          </m:r>
-        </m:oMath>
-      </m:oMathPara>
-    </w:p>
-    <w:p>
-      <w:r>
-        <w:t xml:space="preserve">Bu simülasyonda amaç, bu yöntemi kullanarak DUT’den daha yüksek </w:t>
-      </w:r>
-      <w:proofErr w:type="spellStart"/>
-      <w:r>
-        <w:t>RMS’e</w:t>
-      </w:r>
-      <w:proofErr w:type="spellEnd"/>
-      <w:r>
-        <w:t xml:space="preserve"> sahip referans sinyalleriyle bile yeterli iterasyon sayısında gerçek gürültü spektrumuna çok yakın sonuçlar elde edildiğini göstermektir.</w:t>
-      </w:r>
-    </w:p>
-    <w:p>
-      <w:r>
-        <w:t>Bu simülasyonda özel olarak pa</w:t>
-      </w:r>
-      <w:r>
-        <w:t>rametreler:</w:t>
+      <w:r>
+        <w:rPr>
+          <w:rFonts w:ascii="Cambria Math" w:hAnsi="Cambria Math"/>
+          <w:sz w:val="24"/>
+          <w:szCs w:val="24"/>
+        </w:rPr>
+        <w:t>M = [1, 50, 250, 500, 1000, 2000, 5000, 10000, 20000]</w:t>
+      </w:r>
+    </w:p>
+    <w:p>
+      <w:r>
+        <w:t>Bu MATLAB taramasında iterasyon ortalamasının bağımsız referans gürültüsünü bastırma etkisi incelenmiştir. Her test noktasında yalnız iterasyon sayısı değiştirilmiş, diğer fiziksel ve sayısal parametreler sabit tutulmuştur.</w:t>
+      </w:r>
+    </w:p>
+    <w:p>
+      <w:r>
+        <w:t>MATLAB koşusunda sabit tutulan temel parametreler:</w:t>
       </w:r>
     </w:p>
     <w:p>
@@ -10628,203 +10615,43 @@
           <w:rFonts w:eastAsiaTheme="minorEastAsia"/>
         </w:rPr>
       </w:pPr>
-      <m:oMath>
-        <m:sSub>
-          <m:sSubPr>
-            <m:ctrlPr>
-              <w:rPr>
-                <w:rFonts w:ascii="Cambria Math" w:hAnsi="Cambria Math"/>
-                <w:i/>
-              </w:rPr>
-            </m:ctrlPr>
-          </m:sSubPr>
-          <m:e>
-            <m:r>
-              <w:rPr>
-                <w:rFonts w:ascii="Cambria Math" w:hAnsi="Cambria Math"/>
-              </w:rPr>
-              <m:t>σ</m:t>
-            </m:r>
-          </m:e>
-          <m:sub>
-            <m:r>
-              <w:rPr>
-                <w:rFonts w:ascii="Cambria Math" w:hAnsi="Cambria Math"/>
-              </w:rPr>
-              <m:t>DUT</m:t>
-            </m:r>
-          </m:sub>
-        </m:sSub>
-        <m:r>
-          <w:rPr>
-            <w:rFonts w:ascii="Cambria Math" w:hAnsi="Cambria Math"/>
-          </w:rPr>
-          <m:t>=0.02</m:t>
-        </m:r>
-      </m:oMath>
-      <w:r>
+      <w:r>
+        <w:rPr>
+          <w:rFonts w:ascii="Cambria Math" w:hAnsi="Cambria Math"/>
+          <w:sz w:val="24"/>
+          <w:szCs w:val="24"/>
+        </w:rPr>
+        <w:t>N = 1.000.000; fₛ = 1 MHz; f₀ = 200 kHz; f_c = 300 kHz; LPF derecesi = 4; log-bin sayısı = 100</w:t>
+      </w:r>
+    </w:p>
+    <w:p>
+      <w:r>
+        <w:t>DUT RMS değeri 0,02 rad, birbirinden bağımsız Ref1 ve Ref2 sinyallerinin RMS değerleri ise 0,10 rad olarak belirlenmiştir.</w:t>
+      </w:r>
+    </w:p>
+    <w:p>
+      <w:r>
+        <w:t>Buna göre her bir referansın faz gürültüsü PSD seviyesi DUT’ye göre teorik olarak:</w:t>
+      </w:r>
+    </w:p>
+    <w:p>
+      <w:pPr>
         <w:rPr>
           <w:rFonts w:eastAsiaTheme="minorEastAsia"/>
         </w:rPr>
-        <w:tab/>
-      </w:r>
-      <m:oMath>
-        <m:sSub>
-          <m:sSubPr>
-            <m:ctrlPr>
-              <w:rPr>
-                <w:rFonts w:ascii="Cambria Math" w:hAnsi="Cambria Math"/>
-                <w:i/>
-              </w:rPr>
-            </m:ctrlPr>
-          </m:sSubPr>
-          <m:e>
-            <m:r>
-              <w:rPr>
-                <w:rFonts w:ascii="Cambria Math" w:hAnsi="Cambria Math"/>
-              </w:rPr>
-              <m:t>σ</m:t>
-            </m:r>
-          </m:e>
-          <m:sub>
-            <m:r>
-              <w:rPr>
-                <w:rFonts w:ascii="Cambria Math" w:hAnsi="Cambria Math"/>
-              </w:rPr>
-              <m:t>ref</m:t>
-            </m:r>
-          </m:sub>
-        </m:sSub>
-        <m:r>
-          <w:rPr>
-            <w:rFonts w:ascii="Cambria Math" w:hAnsi="Cambria Math"/>
-          </w:rPr>
-          <m:t>=0.</m:t>
-        </m:r>
-        <m:r>
-          <w:rPr>
-            <w:rFonts w:ascii="Cambria Math" w:hAnsi="Cambria Math"/>
-          </w:rPr>
-          <m:t>1</m:t>
-        </m:r>
-      </m:oMath>
-    </w:p>
-    <w:p>
-      <w:proofErr w:type="gramStart"/>
-      <w:r>
-        <w:t>olarak</w:t>
-      </w:r>
-      <w:proofErr w:type="gramEnd"/>
-      <w:r>
-        <w:t xml:space="preserve"> güncellenmiştir.</w:t>
-      </w:r>
-    </w:p>
-    <w:p>
-      <w:r>
-        <w:t>Referansların PSD seviyesi DUT’ye göre yaklaşık:</w:t>
-      </w:r>
-    </w:p>
-    <w:p>
-      <w:pPr>
-        <w:rPr>
-          <w:rFonts w:eastAsiaTheme="minorEastAsia"/>
-        </w:rPr>
-      </w:pPr>
-      <m:oMathPara>
-        <m:oMath>
-          <m:r>
-            <w:rPr>
-              <w:rFonts w:ascii="Cambria Math" w:hAnsi="Cambria Math"/>
-            </w:rPr>
-            <m:t>20</m:t>
-          </m:r>
-          <m:sSub>
-            <m:sSubPr>
-              <m:ctrlPr>
-                <w:rPr>
-                  <w:rFonts w:ascii="Cambria Math" w:hAnsi="Cambria Math"/>
-                </w:rPr>
-              </m:ctrlPr>
-            </m:sSubPr>
-            <m:e>
-              <m:r>
-                <m:rPr>
-                  <m:nor/>
-                </m:rPr>
-                <w:rPr>
-                  <w:rFonts w:ascii="Cambria Math" w:hAnsi="Cambria Math"/>
-                </w:rPr>
-                <m:t>log</m:t>
-              </m:r>
-            </m:e>
-            <m:sub>
-              <m:r>
-                <w:rPr>
-                  <w:rFonts w:ascii="Cambria Math" w:hAnsi="Cambria Math"/>
-                </w:rPr>
-                <m:t>10</m:t>
-              </m:r>
-            </m:sub>
-          </m:sSub>
-          <m:d>
-            <m:dPr>
-              <m:ctrlPr>
-                <w:rPr>
-                  <w:rFonts w:ascii="Cambria Math" w:hAnsi="Cambria Math"/>
-                  <w:i/>
-                </w:rPr>
-              </m:ctrlPr>
-            </m:dPr>
-            <m:e>
-              <m:f>
-                <m:fPr>
-                  <m:ctrlPr>
-                    <w:rPr>
-                      <w:rFonts w:ascii="Cambria Math" w:hAnsi="Cambria Math"/>
-                      <w:i/>
-                    </w:rPr>
-                  </m:ctrlPr>
-                </m:fPr>
-                <m:num>
-                  <m:r>
-                    <w:rPr>
-                      <w:rFonts w:ascii="Cambria Math" w:hAnsi="Cambria Math"/>
-                    </w:rPr>
-                    <m:t>0.05</m:t>
-                  </m:r>
-                </m:num>
-                <m:den>
-                  <m:r>
-                    <w:rPr>
-                      <w:rFonts w:ascii="Cambria Math" w:hAnsi="Cambria Math"/>
-                    </w:rPr>
-                    <m:t>0.02</m:t>
-                  </m:r>
-                </m:den>
-              </m:f>
-            </m:e>
-          </m:d>
-          <m:r>
-            <w:rPr>
-              <w:rFonts w:ascii="Cambria Math" w:hAnsi="Cambria Math"/>
-            </w:rPr>
-            <m:t xml:space="preserve">≈7.96 </m:t>
-          </m:r>
-          <m:r>
-            <m:rPr>
-              <m:nor/>
-            </m:rPr>
-            <w:rPr>
-              <w:rFonts w:ascii="Cambria Math" w:hAnsi="Cambria Math"/>
-            </w:rPr>
-            <m:t>dB</m:t>
-          </m:r>
-        </m:oMath>
-      </m:oMathPara>
-    </w:p>
-    <w:p>
-      <w:r>
-        <w:t>daha yüksektir.</w:t>
+      </w:pPr>
+      <w:r>
+        <w:rPr>
+          <w:rFonts w:ascii="Cambria Math" w:hAnsi="Cambria Math"/>
+          <w:sz w:val="24"/>
+          <w:szCs w:val="24"/>
+        </w:rPr>
+        <w:t>20 log₁₀(0,10 / 0,02) ≈ 13,98 dB</w:t>
+      </w:r>
+    </w:p>
+    <w:p>
+      <w:r>
+        <w:t>daha yüksektir. Böylece sonlu iterasyon ortalamasının yüksek seviyeli bağımsız referans bileşenlerini bastırma davranışı belirgin bir koşulda gözlenmiştir.</w:t>
       </w:r>
     </w:p>
     <w:p>
@@ -10885,84 +10712,17 @@
           <w:i/>
           <w:sz w:val="18"/>
         </w:rPr>
-        <w:t>Şekil</w:t>
-      </w:r>
-      <w:r>
-        <w:rPr>
-          <w:i/>
-          <w:sz w:val="18"/>
-        </w:rPr>
-        <w:t xml:space="preserve"> 8</w:t>
-      </w:r>
-      <w:r>
-        <w:rPr>
-          <w:i/>
-          <w:sz w:val="18"/>
-        </w:rPr>
-        <w:t>.</w:t>
-      </w:r>
-      <w:r>
-        <w:rPr>
-          <w:i/>
-          <w:sz w:val="18"/>
-        </w:rPr>
-        <w:t>5</w:t>
-      </w:r>
-      <w:r>
-        <w:rPr>
-          <w:i/>
-          <w:sz w:val="18"/>
-        </w:rPr>
-        <w:t xml:space="preserve"> – </w:t>
-      </w:r>
-      <w:r>
-        <w:rPr>
-          <w:i/>
-          <w:sz w:val="18"/>
-        </w:rPr>
-        <w:t xml:space="preserve">Yineleme sayısının </w:t>
-      </w:r>
-      <w:proofErr w:type="spellStart"/>
-      <w:r>
-        <w:rPr>
-          <w:i/>
-          <w:sz w:val="18"/>
-        </w:rPr>
-        <w:t>sepktral</w:t>
-      </w:r>
-      <w:proofErr w:type="spellEnd"/>
-      <w:r>
-        <w:rPr>
-          <w:i/>
-          <w:sz w:val="18"/>
-        </w:rPr>
-        <w:t xml:space="preserve"> gösterime ve tam bant </w:t>
-      </w:r>
-      <w:proofErr w:type="spellStart"/>
-      <w:r>
-        <w:rPr>
-          <w:i/>
-          <w:sz w:val="18"/>
-        </w:rPr>
-        <w:t>MAE’ye</w:t>
-      </w:r>
-      <w:proofErr w:type="spellEnd"/>
-      <w:r>
-        <w:rPr>
-          <w:i/>
-          <w:sz w:val="18"/>
-        </w:rPr>
-        <w:t xml:space="preserve"> etkisi</w:t>
-      </w:r>
-    </w:p>
-    <w:p>
-      <w:r>
-        <w:t>Referans PSD seviyesinin DUT'den teorik olarak yaklaşık 7,96 dB yüksek olduğu özel profilde, 1 yinelemede 6,958 dB olan tam bant MAE 20.000 yinelemede 1,437 dB olmuştur. İlk-son azalma 5,521 dB'dir ve 10.000→20.000 geçişinde MAE artışı görülmüştür.</w:t>
-      </w:r>
-    </w:p>
-    <w:p>
-      <w:r>
-        <w:t>10.000→20.000 geçişindeki MAE değişimi 0,071 dB olmuştur. MAE değişiminin işareti tek başına 20.000 noktasının daha iyi veya kötü olduğunu kanıtlamaz; final değerlendirme tek koşulu Monte Carlo dalgalanması ve geniş bant sistematik tabanla birlikte yapılmıştır.</w:t>
+        <w:t>Şekil 8.5 – İterasyon sayısının spektral gösterime ve tam bant MAE’ye etkisi</w:t>
+      </w:r>
+    </w:p>
+    <w:p>
+      <w:r>
+        <w:t>Tam bant MAE, 1 iterasyonda 17,475 dB iken 20.000 iterasyonda 3,745 dB’ye düşmüştür; toplam azalma 13,729 dB’dir. 10.000 ve 20.000 iterasyon noktalarında MAE sırasıyla 4,337 dB ve 3,745 dB olup son geçişte 0,592 dB ek azalma elde edilmiştir.</w:t>
+      </w:r>
+    </w:p>
+    <w:p>
+      <w:r>
+        <w:t>MAE ara noktalarda monoton azalmamıştır; her iterasyon değeri bağımsız rastgele realizasyonlarla çalıştırıldığından yerel artışlar Monte Carlo değişkenliğiyle uyumludur. Buna rağmen genel eğilim, iterasyon sayısı arttıkça Cross-PSD kestiriminin DUT periodogramına yaklaştığını göstermektedir. 20.000 iterasyon koşusu 665,380 s sürmüş; özellikle yüksek offset bölgesindeki artık ayrışma tam bant MAE’nin sıfıra inmesini engellemiştir.</w:t>
       </w:r>
     </w:p>
     <w:p>

</xml_diff>